<commit_message>
TS 2.1 Kramam Tamil, Sanskrit corrections
</commit_message>
<xml_diff>
--- a/TS-Kramam/TS-2.1/TS 2.1 Sanskrit Krama Paatam Corrections.docx
+++ b/TS-Kramam/TS-2.1/TS 2.1 Sanskrit Krama Paatam Corrections.docx
@@ -101,7 +101,18 @@
           <w:szCs w:val="32"/>
           <w:u w:val="single"/>
         </w:rPr>
-        <w:t xml:space="preserve">Observed till </w:t>
+        <w:t xml:space="preserve">Observed </w:t>
+      </w:r>
+      <w:proofErr w:type="gramStart"/>
+      <w:r>
+        <w:rPr>
+          <w:b/>
+          <w:bCs/>
+          <w:sz w:val="32"/>
+          <w:szCs w:val="32"/>
+          <w:u w:val="single"/>
+        </w:rPr>
+        <w:t xml:space="preserve">till </w:t>
       </w:r>
       <w:r>
         <w:rPr>
@@ -114,6 +125,7 @@
         </w:rPr>
         <w:t>????</w:t>
       </w:r>
+      <w:proofErr w:type="gramEnd"/>
     </w:p>
     <w:p>
       <w:pPr>
@@ -891,6 +903,7 @@
                 <w:szCs w:val="40"/>
               </w:rPr>
             </w:pPr>
+            <w:proofErr w:type="spellStart"/>
             <w:r>
               <w:rPr>
                 <w:rFonts w:ascii="BRH Devanagari Extra" w:hAnsi="BRH Devanagari Extra" w:cs="BRH Devanagari Extra"/>
@@ -919,6 +932,7 @@
               </w:rPr>
               <w:t>û</w:t>
             </w:r>
+            <w:proofErr w:type="spellEnd"/>
             <w:r>
               <w:rPr>
                 <w:rFonts w:ascii="BRH Malayalam Extra" w:hAnsi="BRH Malayalam Extra" w:cs="BRH Malayalam Extra"/>
@@ -972,6 +986,7 @@
               </w:rPr>
               <w:t>–</w:t>
             </w:r>
+            <w:proofErr w:type="spellStart"/>
             <w:r>
               <w:rPr>
                 <w:rFonts w:ascii="BRH Devanagari Extra" w:hAnsi="BRH Devanagari Extra" w:cs="BRH Devanagari Extra"/>
@@ -981,24 +996,45 @@
               </w:rPr>
               <w:t>cNû</w:t>
             </w:r>
-            <w:r>
-              <w:rPr>
-                <w:rFonts w:ascii="BRH Malayalam Extra" w:hAnsi="BRH Malayalam Extra" w:cs="BRH Devanagari Extra"/>
-                <w:b/>
-                <w:color w:val="000000"/>
-                <w:sz w:val="32"/>
-                <w:szCs w:val="40"/>
-              </w:rPr>
-              <w:t>–</w:t>
-            </w:r>
-            <w:r>
-              <w:rPr>
-                <w:rFonts w:ascii="BRH Devanagari Extra" w:hAnsi="BRH Devanagari Extra" w:cs="BRH Devanagari Extra"/>
-                <w:color w:val="000000"/>
-                <w:sz w:val="40"/>
-                <w:szCs w:val="40"/>
-              </w:rPr>
-              <w:t>lÉç iÉxqÉæÿ |</w:t>
+            <w:proofErr w:type="spellEnd"/>
+            <w:r>
+              <w:rPr>
+                <w:rFonts w:ascii="BRH Malayalam Extra" w:hAnsi="BRH Malayalam Extra" w:cs="BRH Devanagari Extra"/>
+                <w:b/>
+                <w:color w:val="000000"/>
+                <w:sz w:val="32"/>
+                <w:szCs w:val="40"/>
+              </w:rPr>
+              <w:t>–</w:t>
+            </w:r>
+            <w:r>
+              <w:rPr>
+                <w:rFonts w:ascii="BRH Devanagari Extra" w:hAnsi="BRH Devanagari Extra" w:cs="BRH Devanagari Extra"/>
+                <w:color w:val="000000"/>
+                <w:sz w:val="40"/>
+                <w:szCs w:val="40"/>
+              </w:rPr>
+              <w:t xml:space="preserve">lÉç </w:t>
+            </w:r>
+            <w:proofErr w:type="spellStart"/>
+            <w:r>
+              <w:rPr>
+                <w:rFonts w:ascii="BRH Devanagari Extra" w:hAnsi="BRH Devanagari Extra" w:cs="BRH Devanagari Extra"/>
+                <w:color w:val="000000"/>
+                <w:sz w:val="40"/>
+                <w:szCs w:val="40"/>
+              </w:rPr>
+              <w:t>iÉxqÉæÿ</w:t>
+            </w:r>
+            <w:proofErr w:type="spellEnd"/>
+            <w:r>
+              <w:rPr>
+                <w:rFonts w:ascii="BRH Devanagari Extra" w:hAnsi="BRH Devanagari Extra" w:cs="BRH Devanagari Extra"/>
+                <w:color w:val="000000"/>
+                <w:sz w:val="40"/>
+                <w:szCs w:val="40"/>
+              </w:rPr>
+              <w:t xml:space="preserve"> |</w:t>
             </w:r>
           </w:p>
         </w:tc>
@@ -1082,6 +1118,7 @@
               </w:rPr>
               <w:t>–</w:t>
             </w:r>
+            <w:proofErr w:type="spellStart"/>
             <w:r>
               <w:rPr>
                 <w:rFonts w:ascii="BRH Devanagari Extra" w:hAnsi="BRH Devanagari Extra" w:cs="BRH Devanagari Extra"/>
@@ -1091,24 +1128,45 @@
               </w:rPr>
               <w:t>cNû</w:t>
             </w:r>
-            <w:r>
-              <w:rPr>
-                <w:rFonts w:ascii="BRH Malayalam Extra" w:hAnsi="BRH Malayalam Extra" w:cs="BRH Devanagari Extra"/>
-                <w:b/>
-                <w:color w:val="000000"/>
-                <w:sz w:val="32"/>
-                <w:szCs w:val="40"/>
-              </w:rPr>
-              <w:t>–</w:t>
-            </w:r>
-            <w:r>
-              <w:rPr>
-                <w:rFonts w:ascii="BRH Devanagari Extra" w:hAnsi="BRH Devanagari Extra" w:cs="BRH Devanagari Extra"/>
-                <w:color w:val="000000"/>
-                <w:sz w:val="40"/>
-                <w:szCs w:val="40"/>
-              </w:rPr>
-              <w:t>lÉç iÉxqÉæÿ |</w:t>
+            <w:proofErr w:type="spellEnd"/>
+            <w:r>
+              <w:rPr>
+                <w:rFonts w:ascii="BRH Malayalam Extra" w:hAnsi="BRH Malayalam Extra" w:cs="BRH Devanagari Extra"/>
+                <w:b/>
+                <w:color w:val="000000"/>
+                <w:sz w:val="32"/>
+                <w:szCs w:val="40"/>
+              </w:rPr>
+              <w:t>–</w:t>
+            </w:r>
+            <w:r>
+              <w:rPr>
+                <w:rFonts w:ascii="BRH Devanagari Extra" w:hAnsi="BRH Devanagari Extra" w:cs="BRH Devanagari Extra"/>
+                <w:color w:val="000000"/>
+                <w:sz w:val="40"/>
+                <w:szCs w:val="40"/>
+              </w:rPr>
+              <w:t xml:space="preserve">lÉç </w:t>
+            </w:r>
+            <w:proofErr w:type="spellStart"/>
+            <w:r>
+              <w:rPr>
+                <w:rFonts w:ascii="BRH Devanagari Extra" w:hAnsi="BRH Devanagari Extra" w:cs="BRH Devanagari Extra"/>
+                <w:color w:val="000000"/>
+                <w:sz w:val="40"/>
+                <w:szCs w:val="40"/>
+              </w:rPr>
+              <w:t>iÉxqÉæÿ</w:t>
+            </w:r>
+            <w:proofErr w:type="spellEnd"/>
+            <w:r>
+              <w:rPr>
+                <w:rFonts w:ascii="BRH Devanagari Extra" w:hAnsi="BRH Devanagari Extra" w:cs="BRH Devanagari Extra"/>
+                <w:color w:val="000000"/>
+                <w:sz w:val="40"/>
+                <w:szCs w:val="40"/>
+              </w:rPr>
+              <w:t xml:space="preserve"> |</w:t>
             </w:r>
           </w:p>
         </w:tc>
@@ -1625,6 +1683,571 @@
       </w:tr>
       <w:tr>
         <w:trPr>
+          <w:trHeight w:val="1621"/>
+        </w:trPr>
+        <w:tc>
+          <w:tcPr>
+            <w:tcW w:w="3573" w:type="dxa"/>
+            <w:tcBorders>
+              <w:top w:val="single" w:sz="4" w:space="0" w:color="000000"/>
+              <w:left w:val="single" w:sz="4" w:space="0" w:color="000000"/>
+              <w:bottom w:val="single" w:sz="4" w:space="0" w:color="000000"/>
+              <w:right w:val="single" w:sz="4" w:space="0" w:color="000000"/>
+            </w:tcBorders>
+          </w:tcPr>
+          <w:p>
+            <w:pPr>
+              <w:widowControl w:val="0"/>
+              <w:autoSpaceDE w:val="0"/>
+              <w:autoSpaceDN w:val="0"/>
+              <w:adjustRightInd w:val="0"/>
+              <w:spacing w:before="0" w:line="240" w:lineRule="auto"/>
+              <w:rPr>
+                <w:rFonts w:cs="Arial"/>
+                <w:b/>
+                <w:sz w:val="28"/>
+                <w:szCs w:val="28"/>
+                <w:lang w:val="it-IT"/>
+              </w:rPr>
+            </w:pPr>
+            <w:r>
+              <w:rPr>
+                <w:rFonts w:cs="Arial"/>
+                <w:b/>
+                <w:sz w:val="28"/>
+                <w:szCs w:val="28"/>
+                <w:lang w:val="it-IT"/>
+              </w:rPr>
+              <w:t>TS 2.1.</w:t>
+            </w:r>
+            <w:r>
+              <w:rPr>
+                <w:rFonts w:cs="Arial"/>
+                <w:b/>
+                <w:sz w:val="28"/>
+                <w:szCs w:val="28"/>
+                <w:lang w:val="it-IT"/>
+              </w:rPr>
+              <w:t>4.</w:t>
+            </w:r>
+            <w:r>
+              <w:rPr>
+                <w:rFonts w:cs="Arial"/>
+                <w:b/>
+                <w:sz w:val="28"/>
+                <w:szCs w:val="28"/>
+                <w:lang w:val="it-IT"/>
+              </w:rPr>
+              <w:t>7</w:t>
+            </w:r>
+            <w:r>
+              <w:rPr>
+                <w:rFonts w:cs="Arial"/>
+                <w:b/>
+                <w:sz w:val="28"/>
+                <w:szCs w:val="28"/>
+                <w:lang w:val="it-IT"/>
+              </w:rPr>
+              <w:t xml:space="preserve"> - Kramam</w:t>
+            </w:r>
+          </w:p>
+          <w:p>
+            <w:pPr>
+              <w:widowControl w:val="0"/>
+              <w:autoSpaceDE w:val="0"/>
+              <w:autoSpaceDN w:val="0"/>
+              <w:adjustRightInd w:val="0"/>
+              <w:spacing w:before="0" w:line="240" w:lineRule="auto"/>
+              <w:rPr>
+                <w:rFonts w:cs="Arial"/>
+                <w:b/>
+                <w:sz w:val="28"/>
+                <w:szCs w:val="28"/>
+                <w:lang w:val="it-IT"/>
+              </w:rPr>
+            </w:pPr>
+            <w:r>
+              <w:rPr>
+                <w:rFonts w:cs="Arial"/>
+                <w:b/>
+                <w:sz w:val="28"/>
+                <w:szCs w:val="28"/>
+                <w:lang w:val="it-IT"/>
+              </w:rPr>
+              <w:t xml:space="preserve">Krama Vaakyam No. </w:t>
+            </w:r>
+            <w:r>
+              <w:rPr>
+                <w:rFonts w:cs="Arial"/>
+                <w:b/>
+                <w:sz w:val="28"/>
+                <w:szCs w:val="28"/>
+                <w:lang w:val="it-IT"/>
+              </w:rPr>
+              <w:t>48</w:t>
+            </w:r>
+            <w:r>
+              <w:rPr>
+                <w:rFonts w:cs="Arial"/>
+                <w:b/>
+                <w:sz w:val="28"/>
+                <w:szCs w:val="28"/>
+                <w:lang w:val="it-IT"/>
+              </w:rPr>
+              <w:br/>
+              <w:t xml:space="preserve">Panchaati No.  </w:t>
+            </w:r>
+            <w:r>
+              <w:rPr>
+                <w:rFonts w:cs="Arial"/>
+                <w:b/>
+                <w:sz w:val="28"/>
+                <w:szCs w:val="28"/>
+                <w:lang w:val="it-IT"/>
+              </w:rPr>
+              <w:t>2</w:t>
+            </w:r>
+            <w:r>
+              <w:rPr>
+                <w:rFonts w:cs="Arial"/>
+                <w:b/>
+                <w:sz w:val="28"/>
+                <w:szCs w:val="28"/>
+                <w:lang w:val="it-IT"/>
+              </w:rPr>
+              <w:t>7</w:t>
+            </w:r>
+          </w:p>
+        </w:tc>
+        <w:tc>
+          <w:tcPr>
+            <w:tcW w:w="4896" w:type="dxa"/>
+            <w:tcBorders>
+              <w:top w:val="single" w:sz="4" w:space="0" w:color="000000"/>
+              <w:left w:val="single" w:sz="4" w:space="0" w:color="000000"/>
+              <w:bottom w:val="single" w:sz="4" w:space="0" w:color="000000"/>
+              <w:right w:val="single" w:sz="4" w:space="0" w:color="000000"/>
+            </w:tcBorders>
+          </w:tcPr>
+          <w:p>
+            <w:pPr>
+              <w:widowControl w:val="0"/>
+              <w:autoSpaceDE w:val="0"/>
+              <w:autoSpaceDN w:val="0"/>
+              <w:adjustRightInd w:val="0"/>
+              <w:spacing w:before="0" w:line="240" w:lineRule="auto"/>
+              <w:rPr>
+                <w:rFonts w:ascii="BRH Devanagari Extra" w:hAnsi="BRH Devanagari Extra" w:cs="BRH Devanagari Extra"/>
+                <w:color w:val="000000"/>
+                <w:sz w:val="40"/>
+                <w:szCs w:val="40"/>
+                <w:lang w:val="it-IT"/>
+              </w:rPr>
+            </w:pPr>
+            <w:r>
+              <w:rPr>
+                <w:rFonts w:ascii="BRH Devanagari Extra" w:hAnsi="BRH Devanagari Extra" w:cs="BRH Devanagari Extra"/>
+                <w:color w:val="000000"/>
+                <w:sz w:val="40"/>
+                <w:szCs w:val="40"/>
+                <w:lang w:val="it-IT"/>
+              </w:rPr>
+              <w:t>pÉ</w:t>
+            </w:r>
+            <w:r>
+              <w:rPr>
+                <w:rFonts w:ascii="BRH Malayalam Extra" w:hAnsi="BRH Malayalam Extra" w:cs="BRH Devanagari Extra"/>
+                <w:b/>
+                <w:color w:val="000000"/>
+                <w:sz w:val="32"/>
+                <w:szCs w:val="40"/>
+                <w:lang w:val="it-IT"/>
+              </w:rPr>
+              <w:t>–</w:t>
+            </w:r>
+            <w:r>
+              <w:rPr>
+                <w:rFonts w:ascii="BRH Devanagari Extra" w:hAnsi="BRH Devanagari Extra" w:cs="BRH Devanagari Extra"/>
+                <w:color w:val="000000"/>
+                <w:sz w:val="40"/>
+                <w:szCs w:val="40"/>
+                <w:lang w:val="it-IT"/>
+              </w:rPr>
+              <w:t>uÉ</w:t>
+            </w:r>
+            <w:r>
+              <w:rPr>
+                <w:rFonts w:ascii="BRH Malayalam Extra" w:hAnsi="BRH Malayalam Extra" w:cs="BRH Devanagari Extra"/>
+                <w:b/>
+                <w:color w:val="000000"/>
+                <w:sz w:val="32"/>
+                <w:szCs w:val="40"/>
+                <w:lang w:val="it-IT"/>
+              </w:rPr>
+              <w:t>–</w:t>
+            </w:r>
+            <w:r>
+              <w:rPr>
+                <w:rFonts w:ascii="BRH Devanagari Extra" w:hAnsi="BRH Devanagari Extra" w:cs="BRH Devanagari Extra"/>
+                <w:color w:val="000000"/>
+                <w:sz w:val="40"/>
+                <w:szCs w:val="40"/>
+                <w:lang w:val="it-IT"/>
+              </w:rPr>
+              <w:t>ÌiÉ</w:t>
+            </w:r>
+            <w:r>
+              <w:rPr>
+                <w:rFonts w:ascii="BRH Malayalam Extra" w:hAnsi="BRH Malayalam Extra" w:cs="BRH Devanagari Extra"/>
+                <w:b/>
+                <w:color w:val="000000"/>
+                <w:sz w:val="32"/>
+                <w:szCs w:val="40"/>
+                <w:lang w:val="it-IT"/>
+              </w:rPr>
+              <w:t>–</w:t>
+            </w:r>
+            <w:r>
+              <w:rPr>
+                <w:rFonts w:ascii="BRH Devanagari Extra" w:hAnsi="BRH Devanagari Extra" w:cs="BRH Devanagari Extra"/>
+                <w:color w:val="000000"/>
+                <w:sz w:val="40"/>
+                <w:szCs w:val="40"/>
+                <w:lang w:val="it-IT"/>
+              </w:rPr>
+              <w:t xml:space="preserve"> mÉ</w:t>
+            </w:r>
+            <w:r>
+              <w:rPr>
+                <w:rFonts w:ascii="BRH Malayalam Extra" w:hAnsi="BRH Malayalam Extra" w:cs="BRH Devanagari Extra"/>
+                <w:b/>
+                <w:color w:val="000000"/>
+                <w:sz w:val="32"/>
+                <w:szCs w:val="40"/>
+                <w:lang w:val="it-IT"/>
+              </w:rPr>
+              <w:t>–</w:t>
+            </w:r>
+            <w:r>
+              <w:rPr>
+                <w:rFonts w:ascii="BRH Devanagari Extra" w:hAnsi="BRH Devanagari Extra" w:cs="BRH Devanagari Extra"/>
+                <w:color w:val="000000"/>
+                <w:sz w:val="40"/>
+                <w:szCs w:val="40"/>
+                <w:lang w:val="it-IT"/>
+              </w:rPr>
+              <w:t>r</w:t>
+            </w:r>
+            <w:r>
+              <w:rPr>
+                <w:rFonts w:ascii="BRH Devanagari Extra" w:hAnsi="BRH Devanagari Extra" w:cs="BRH Devanagari Extra"/>
+                <w:color w:val="000000"/>
+                <w:sz w:val="40"/>
+                <w:szCs w:val="40"/>
+                <w:lang w:val="it-IT"/>
+              </w:rPr>
+              <w:t>É</w:t>
+            </w:r>
+            <w:r>
+              <w:rPr>
+                <w:rFonts w:ascii="BRH Devanagari Extra" w:hAnsi="BRH Devanagari Extra" w:cs="BRH Devanagari Extra"/>
+                <w:sz w:val="40"/>
+                <w:szCs w:val="40"/>
+                <w:lang w:val="it-IT"/>
+              </w:rPr>
+              <w:t>Éï</w:t>
+            </w:r>
+            <w:r>
+              <w:rPr>
+                <w:rFonts w:ascii="BRH Malayalam Extra" w:hAnsi="BRH Malayalam Extra" w:cs="BRH Devanagari Extra"/>
+                <w:b/>
+                <w:sz w:val="32"/>
+                <w:szCs w:val="40"/>
+                <w:lang w:val="it-IT"/>
+              </w:rPr>
+              <w:t>–</w:t>
+            </w:r>
+            <w:r>
+              <w:rPr>
+                <w:rFonts w:ascii="BRH Devanagari Extra" w:hAnsi="BRH Devanagari Extra" w:cs="BRH Devanagari Extra"/>
+                <w:color w:val="EE0000"/>
+                <w:sz w:val="40"/>
+                <w:szCs w:val="40"/>
+                <w:highlight w:val="yellow"/>
+                <w:lang w:val="it-IT"/>
+              </w:rPr>
+              <w:t>UÏ</w:t>
+            </w:r>
+            <w:r>
+              <w:rPr>
+                <w:rFonts w:ascii="BRH Devanagari Extra" w:hAnsi="BRH Devanagari Extra" w:cs="BRH Devanagari Extra"/>
+                <w:color w:val="000000"/>
+                <w:sz w:val="40"/>
+                <w:szCs w:val="40"/>
+                <w:lang w:val="it-IT"/>
+              </w:rPr>
+              <w:t xml:space="preserve"> | mÉ</w:t>
+            </w:r>
+            <w:r>
+              <w:rPr>
+                <w:rFonts w:ascii="BRH Malayalam Extra" w:hAnsi="BRH Malayalam Extra" w:cs="BRH Devanagari Extra"/>
+                <w:b/>
+                <w:color w:val="000000"/>
+                <w:sz w:val="32"/>
+                <w:szCs w:val="40"/>
+                <w:lang w:val="it-IT"/>
+              </w:rPr>
+              <w:t>–</w:t>
+            </w:r>
+            <w:r>
+              <w:rPr>
+                <w:rFonts w:ascii="BRH Devanagari Extra" w:hAnsi="BRH Devanagari Extra" w:cs="BRH Devanagari Extra"/>
+                <w:color w:val="000000"/>
+                <w:sz w:val="40"/>
+                <w:szCs w:val="40"/>
+                <w:lang w:val="it-IT"/>
+              </w:rPr>
+              <w:t>rÉÉï</w:t>
+            </w:r>
+            <w:r>
+              <w:rPr>
+                <w:rFonts w:ascii="BRH Malayalam Extra" w:hAnsi="BRH Malayalam Extra" w:cs="BRH Devanagari Extra"/>
+                <w:b/>
+                <w:color w:val="000000"/>
+                <w:sz w:val="32"/>
+                <w:szCs w:val="40"/>
+                <w:lang w:val="it-IT"/>
+              </w:rPr>
+              <w:t>–</w:t>
+            </w:r>
+            <w:r>
+              <w:rPr>
+                <w:rFonts w:ascii="BRH Devanagari Extra" w:hAnsi="BRH Devanagari Extra" w:cs="BRH Devanagari Extra"/>
+                <w:color w:val="000000"/>
+                <w:sz w:val="40"/>
+                <w:szCs w:val="40"/>
+                <w:lang w:val="it-IT"/>
+              </w:rPr>
+              <w:t>UÏuÉþ |</w:t>
+            </w:r>
+          </w:p>
+        </w:tc>
+        <w:tc>
+          <w:tcPr>
+            <w:tcW w:w="5220" w:type="dxa"/>
+            <w:tcBorders>
+              <w:top w:val="single" w:sz="4" w:space="0" w:color="000000"/>
+              <w:left w:val="single" w:sz="4" w:space="0" w:color="000000"/>
+              <w:bottom w:val="single" w:sz="4" w:space="0" w:color="000000"/>
+              <w:right w:val="single" w:sz="4" w:space="0" w:color="000000"/>
+            </w:tcBorders>
+          </w:tcPr>
+          <w:p>
+            <w:pPr>
+              <w:widowControl w:val="0"/>
+              <w:autoSpaceDE w:val="0"/>
+              <w:autoSpaceDN w:val="0"/>
+              <w:adjustRightInd w:val="0"/>
+              <w:spacing w:before="0" w:line="240" w:lineRule="auto"/>
+              <w:rPr>
+                <w:rFonts w:ascii="BRH Devanagari Extra" w:hAnsi="BRH Devanagari Extra" w:cs="BRH Devanagari Extra"/>
+                <w:color w:val="000000"/>
+                <w:sz w:val="40"/>
+                <w:szCs w:val="40"/>
+                <w:lang w:val="it-IT"/>
+              </w:rPr>
+            </w:pPr>
+            <w:r>
+              <w:rPr>
+                <w:rFonts w:ascii="BRH Devanagari Extra" w:hAnsi="BRH Devanagari Extra" w:cs="BRH Devanagari Extra"/>
+                <w:color w:val="000000"/>
+                <w:sz w:val="40"/>
+                <w:szCs w:val="40"/>
+                <w:lang w:val="it-IT"/>
+              </w:rPr>
+              <w:t>pÉ</w:t>
+            </w:r>
+            <w:r>
+              <w:rPr>
+                <w:rFonts w:ascii="BRH Malayalam Extra" w:hAnsi="BRH Malayalam Extra" w:cs="BRH Devanagari Extra"/>
+                <w:b/>
+                <w:color w:val="000000"/>
+                <w:sz w:val="32"/>
+                <w:szCs w:val="40"/>
+                <w:lang w:val="it-IT"/>
+              </w:rPr>
+              <w:t>–</w:t>
+            </w:r>
+            <w:r>
+              <w:rPr>
+                <w:rFonts w:ascii="BRH Devanagari Extra" w:hAnsi="BRH Devanagari Extra" w:cs="BRH Devanagari Extra"/>
+                <w:color w:val="000000"/>
+                <w:sz w:val="40"/>
+                <w:szCs w:val="40"/>
+                <w:lang w:val="it-IT"/>
+              </w:rPr>
+              <w:t>uÉ</w:t>
+            </w:r>
+            <w:r>
+              <w:rPr>
+                <w:rFonts w:ascii="BRH Malayalam Extra" w:hAnsi="BRH Malayalam Extra" w:cs="BRH Devanagari Extra"/>
+                <w:b/>
+                <w:color w:val="000000"/>
+                <w:sz w:val="32"/>
+                <w:szCs w:val="40"/>
+                <w:lang w:val="it-IT"/>
+              </w:rPr>
+              <w:t>–</w:t>
+            </w:r>
+            <w:r>
+              <w:rPr>
+                <w:rFonts w:ascii="BRH Devanagari Extra" w:hAnsi="BRH Devanagari Extra" w:cs="BRH Devanagari Extra"/>
+                <w:color w:val="000000"/>
+                <w:sz w:val="40"/>
+                <w:szCs w:val="40"/>
+                <w:lang w:val="it-IT"/>
+              </w:rPr>
+              <w:t>ÌiÉ</w:t>
+            </w:r>
+            <w:r>
+              <w:rPr>
+                <w:rFonts w:ascii="BRH Malayalam Extra" w:hAnsi="BRH Malayalam Extra" w:cs="BRH Devanagari Extra"/>
+                <w:b/>
+                <w:color w:val="000000"/>
+                <w:sz w:val="32"/>
+                <w:szCs w:val="40"/>
+                <w:lang w:val="it-IT"/>
+              </w:rPr>
+              <w:t>–</w:t>
+            </w:r>
+            <w:r>
+              <w:rPr>
+                <w:rFonts w:ascii="BRH Devanagari Extra" w:hAnsi="BRH Devanagari Extra" w:cs="BRH Devanagari Extra"/>
+                <w:color w:val="000000"/>
+                <w:sz w:val="40"/>
+                <w:szCs w:val="40"/>
+                <w:lang w:val="it-IT"/>
+              </w:rPr>
+              <w:t xml:space="preserve"> mÉ</w:t>
+            </w:r>
+            <w:r>
+              <w:rPr>
+                <w:rFonts w:ascii="BRH Malayalam Extra" w:hAnsi="BRH Malayalam Extra" w:cs="BRH Devanagari Extra"/>
+                <w:b/>
+                <w:color w:val="000000"/>
+                <w:sz w:val="32"/>
+                <w:szCs w:val="40"/>
+                <w:lang w:val="it-IT"/>
+              </w:rPr>
+              <w:t>–</w:t>
+            </w:r>
+            <w:r>
+              <w:rPr>
+                <w:rFonts w:ascii="BRH Devanagari Extra" w:hAnsi="BRH Devanagari Extra" w:cs="BRH Devanagari Extra"/>
+                <w:color w:val="000000"/>
+                <w:sz w:val="40"/>
+                <w:szCs w:val="40"/>
+                <w:lang w:val="it-IT"/>
+              </w:rPr>
+              <w:t>r</w:t>
+            </w:r>
+            <w:r>
+              <w:rPr>
+                <w:rFonts w:ascii="BRH Devanagari Extra" w:hAnsi="BRH Devanagari Extra" w:cs="BRH Devanagari Extra"/>
+                <w:color w:val="000000"/>
+                <w:sz w:val="40"/>
+                <w:szCs w:val="40"/>
+                <w:lang w:val="it-IT"/>
+              </w:rPr>
+              <w:t>É</w:t>
+            </w:r>
+            <w:r>
+              <w:rPr>
+                <w:rFonts w:ascii="BRH Devanagari Extra" w:hAnsi="BRH Devanagari Extra" w:cs="BRH Devanagari Extra"/>
+                <w:sz w:val="40"/>
+                <w:szCs w:val="40"/>
+                <w:lang w:val="it-IT"/>
+              </w:rPr>
+              <w:t>Éï</w:t>
+            </w:r>
+            <w:r>
+              <w:rPr>
+                <w:rFonts w:ascii="BRH Malayalam Extra" w:hAnsi="BRH Malayalam Extra" w:cs="BRH Devanagari Extra"/>
+                <w:b/>
+                <w:sz w:val="32"/>
+                <w:szCs w:val="40"/>
+                <w:lang w:val="it-IT"/>
+              </w:rPr>
+              <w:t>–</w:t>
+            </w:r>
+            <w:r>
+              <w:rPr>
+                <w:rFonts w:ascii="BRH Devanagari Extra" w:hAnsi="BRH Devanagari Extra" w:cs="BRH Devanagari Extra"/>
+                <w:color w:val="000000"/>
+                <w:sz w:val="40"/>
+                <w:szCs w:val="40"/>
+                <w:highlight w:val="green"/>
+                <w:lang w:val="it-IT"/>
+              </w:rPr>
+              <w:t>ËU</w:t>
+            </w:r>
+            <w:r>
+              <w:rPr>
+                <w:rFonts w:ascii="BRH Devanagari Extra" w:hAnsi="BRH Devanagari Extra" w:cs="BRH Devanagari Extra"/>
+                <w:color w:val="000000"/>
+                <w:sz w:val="40"/>
+                <w:szCs w:val="40"/>
+                <w:lang w:val="it-IT"/>
+              </w:rPr>
+              <w:t xml:space="preserve"> | mÉ</w:t>
+            </w:r>
+            <w:r>
+              <w:rPr>
+                <w:rFonts w:ascii="BRH Malayalam Extra" w:hAnsi="BRH Malayalam Extra" w:cs="BRH Devanagari Extra"/>
+                <w:b/>
+                <w:color w:val="000000"/>
+                <w:sz w:val="32"/>
+                <w:szCs w:val="40"/>
+                <w:lang w:val="it-IT"/>
+              </w:rPr>
+              <w:t>–</w:t>
+            </w:r>
+            <w:r>
+              <w:rPr>
+                <w:rFonts w:ascii="BRH Devanagari Extra" w:hAnsi="BRH Devanagari Extra" w:cs="BRH Devanagari Extra"/>
+                <w:color w:val="000000"/>
+                <w:sz w:val="40"/>
+                <w:szCs w:val="40"/>
+                <w:lang w:val="it-IT"/>
+              </w:rPr>
+              <w:t>rÉÉï</w:t>
+            </w:r>
+            <w:r>
+              <w:rPr>
+                <w:rFonts w:ascii="BRH Malayalam Extra" w:hAnsi="BRH Malayalam Extra" w:cs="BRH Devanagari Extra"/>
+                <w:b/>
+                <w:color w:val="000000"/>
+                <w:sz w:val="32"/>
+                <w:szCs w:val="40"/>
+                <w:lang w:val="it-IT"/>
+              </w:rPr>
+              <w:t>–</w:t>
+            </w:r>
+            <w:r>
+              <w:rPr>
+                <w:rFonts w:ascii="BRH Devanagari Extra" w:hAnsi="BRH Devanagari Extra" w:cs="BRH Devanagari Extra"/>
+                <w:color w:val="000000"/>
+                <w:sz w:val="40"/>
+                <w:szCs w:val="40"/>
+                <w:lang w:val="it-IT"/>
+              </w:rPr>
+              <w:t>UÏuÉþ |</w:t>
+            </w:r>
+          </w:p>
+        </w:tc>
+      </w:tr>
+      <w:tr>
+        <w:trPr>
           <w:trHeight w:val="1351"/>
         </w:trPr>
         <w:tc>
@@ -1660,6 +2283,7 @@
                 <w:szCs w:val="28"/>
                 <w:lang w:val="it-IT"/>
               </w:rPr>
+              <w:lastRenderedPageBreak/>
               <w:t>TS 2.1.</w:t>
             </w:r>
             <w:r>
@@ -2566,106 +3190,7 @@
           </w:p>
         </w:tc>
       </w:tr>
-      <w:tr>
-        <w:trPr>
-          <w:trHeight w:val="1034"/>
-        </w:trPr>
-        <w:tc>
-          <w:tcPr>
-            <w:tcW w:w="3573" w:type="dxa"/>
-            <w:tcBorders>
-              <w:top w:val="single" w:sz="4" w:space="0" w:color="000000"/>
-              <w:left w:val="single" w:sz="4" w:space="0" w:color="000000"/>
-              <w:bottom w:val="single" w:sz="4" w:space="0" w:color="000000"/>
-              <w:right w:val="single" w:sz="4" w:space="0" w:color="000000"/>
-            </w:tcBorders>
-          </w:tcPr>
-          <w:p>
-            <w:pPr>
-              <w:widowControl w:val="0"/>
-              <w:autoSpaceDE w:val="0"/>
-              <w:autoSpaceDN w:val="0"/>
-              <w:adjustRightInd w:val="0"/>
-              <w:spacing w:before="0" w:line="240" w:lineRule="auto"/>
-              <w:rPr>
-                <w:rFonts w:cs="Arial"/>
-                <w:b/>
-                <w:sz w:val="28"/>
-                <w:szCs w:val="28"/>
-                <w:lang w:val="it-IT"/>
-              </w:rPr>
-            </w:pPr>
-          </w:p>
-        </w:tc>
-        <w:tc>
-          <w:tcPr>
-            <w:tcW w:w="4896" w:type="dxa"/>
-            <w:tcBorders>
-              <w:top w:val="single" w:sz="4" w:space="0" w:color="000000"/>
-              <w:left w:val="single" w:sz="4" w:space="0" w:color="000000"/>
-              <w:bottom w:val="single" w:sz="4" w:space="0" w:color="000000"/>
-              <w:right w:val="single" w:sz="4" w:space="0" w:color="000000"/>
-            </w:tcBorders>
-          </w:tcPr>
-          <w:p>
-            <w:pPr>
-              <w:widowControl w:val="0"/>
-              <w:autoSpaceDE w:val="0"/>
-              <w:autoSpaceDN w:val="0"/>
-              <w:adjustRightInd w:val="0"/>
-              <w:spacing w:before="0" w:line="240" w:lineRule="auto"/>
-              <w:rPr>
-                <w:rFonts w:ascii="BRH Devanagari Extra" w:hAnsi="BRH Devanagari Extra" w:cs="BRH Devanagari Extra"/>
-                <w:color w:val="000000"/>
-                <w:sz w:val="40"/>
-                <w:szCs w:val="40"/>
-                <w:lang w:val="it-IT"/>
-              </w:rPr>
-            </w:pPr>
-          </w:p>
-        </w:tc>
-        <w:tc>
-          <w:tcPr>
-            <w:tcW w:w="5220" w:type="dxa"/>
-            <w:tcBorders>
-              <w:top w:val="single" w:sz="4" w:space="0" w:color="000000"/>
-              <w:left w:val="single" w:sz="4" w:space="0" w:color="000000"/>
-              <w:bottom w:val="single" w:sz="4" w:space="0" w:color="000000"/>
-              <w:right w:val="single" w:sz="4" w:space="0" w:color="000000"/>
-            </w:tcBorders>
-          </w:tcPr>
-          <w:p>
-            <w:pPr>
-              <w:widowControl w:val="0"/>
-              <w:autoSpaceDE w:val="0"/>
-              <w:autoSpaceDN w:val="0"/>
-              <w:adjustRightInd w:val="0"/>
-              <w:spacing w:before="0" w:line="240" w:lineRule="auto"/>
-              <w:rPr>
-                <w:rFonts w:ascii="BRH Devanagari Extra" w:hAnsi="BRH Devanagari Extra" w:cs="BRH Devanagari Extra"/>
-                <w:color w:val="000000"/>
-                <w:sz w:val="40"/>
-                <w:szCs w:val="40"/>
-                <w:lang w:val="it-IT"/>
-              </w:rPr>
-            </w:pPr>
-          </w:p>
-        </w:tc>
-      </w:tr>
     </w:tbl>
-    <w:p>
-      <w:pPr>
-        <w:jc w:val="center"/>
-        <w:rPr>
-          <w:b/>
-          <w:bCs/>
-          <w:sz w:val="32"/>
-          <w:szCs w:val="32"/>
-          <w:u w:val="single"/>
-          <w:lang w:val="it-IT"/>
-        </w:rPr>
-      </w:pPr>
-    </w:p>
     <w:p>
       <w:pPr>
         <w:jc w:val="center"/>
@@ -3064,6 +3589,7 @@
               </w:rPr>
               <w:t>–</w:t>
             </w:r>
+            <w:proofErr w:type="spellStart"/>
             <w:r>
               <w:rPr>
                 <w:rFonts w:ascii="BRH Devanagari Extra" w:hAnsi="BRH Devanagari Extra" w:cs="BRH Devanagari Extra"/>
@@ -3090,26 +3616,47 @@
                 <w:sz w:val="40"/>
                 <w:szCs w:val="40"/>
               </w:rPr>
-              <w:t>þÌiÉ Ì² - Ã</w:t>
-            </w:r>
-            <w:r>
-              <w:rPr>
-                <w:rFonts w:ascii="BRH Malayalam Extra" w:hAnsi="BRH Malayalam Extra" w:cs="BRH Devanagari Extra"/>
-                <w:b/>
-                <w:color w:val="000000"/>
-                <w:sz w:val="32"/>
-                <w:szCs w:val="40"/>
-              </w:rPr>
-              <w:t>–</w:t>
-            </w:r>
-            <w:r>
-              <w:rPr>
-                <w:rFonts w:ascii="BRH Devanagari Extra" w:hAnsi="BRH Devanagari Extra" w:cs="BRH Devanagari Extra"/>
-                <w:color w:val="000000"/>
-                <w:sz w:val="40"/>
-                <w:szCs w:val="40"/>
-              </w:rPr>
-              <w:t>mÉÉqÉç |</w:t>
+              <w:t>þÌiÉ</w:t>
+            </w:r>
+            <w:proofErr w:type="spellEnd"/>
+            <w:r>
+              <w:rPr>
+                <w:rFonts w:ascii="BRH Devanagari Extra" w:hAnsi="BRH Devanagari Extra" w:cs="BRH Devanagari Extra"/>
+                <w:color w:val="000000"/>
+                <w:sz w:val="40"/>
+                <w:szCs w:val="40"/>
+              </w:rPr>
+              <w:t xml:space="preserve"> Ì² - Ã</w:t>
+            </w:r>
+            <w:r>
+              <w:rPr>
+                <w:rFonts w:ascii="BRH Malayalam Extra" w:hAnsi="BRH Malayalam Extra" w:cs="BRH Devanagari Extra"/>
+                <w:b/>
+                <w:color w:val="000000"/>
+                <w:sz w:val="32"/>
+                <w:szCs w:val="40"/>
+              </w:rPr>
+              <w:t>–</w:t>
+            </w:r>
+            <w:proofErr w:type="spellStart"/>
+            <w:r>
+              <w:rPr>
+                <w:rFonts w:ascii="BRH Devanagari Extra" w:hAnsi="BRH Devanagari Extra" w:cs="BRH Devanagari Extra"/>
+                <w:color w:val="000000"/>
+                <w:sz w:val="40"/>
+                <w:szCs w:val="40"/>
+              </w:rPr>
+              <w:t>mÉÉqÉç</w:t>
+            </w:r>
+            <w:proofErr w:type="spellEnd"/>
+            <w:r>
+              <w:rPr>
+                <w:rFonts w:ascii="BRH Devanagari Extra" w:hAnsi="BRH Devanagari Extra" w:cs="BRH Devanagari Extra"/>
+                <w:color w:val="000000"/>
+                <w:sz w:val="40"/>
+                <w:szCs w:val="40"/>
+              </w:rPr>
+              <w:t xml:space="preserve"> |</w:t>
             </w:r>
           </w:p>
         </w:tc>
@@ -3169,6 +3716,7 @@
               </w:rPr>
               <w:t>–</w:t>
             </w:r>
+            <w:proofErr w:type="spellStart"/>
             <w:r>
               <w:rPr>
                 <w:rFonts w:ascii="BRH Devanagari Extra" w:hAnsi="BRH Devanagari Extra" w:cs="BRH Devanagari Extra"/>
@@ -3207,6 +3755,7 @@
               </w:rPr>
               <w:t>þ</w:t>
             </w:r>
+            <w:proofErr w:type="spellEnd"/>
             <w:r>
               <w:rPr>
                 <w:rFonts w:ascii="BRH Devanagari Extra" w:hAnsi="BRH Devanagari Extra" w:cs="BRH Devanagari Extra"/>
@@ -3226,14 +3775,25 @@
               </w:rPr>
               <w:t>–</w:t>
             </w:r>
-            <w:r>
-              <w:rPr>
-                <w:rFonts w:ascii="BRH Devanagari Extra" w:hAnsi="BRH Devanagari Extra" w:cs="BRH Devanagari Extra"/>
-                <w:color w:val="000000"/>
-                <w:sz w:val="40"/>
-                <w:szCs w:val="40"/>
-              </w:rPr>
-              <w:t>mÉÉqÉç |</w:t>
+            <w:proofErr w:type="spellStart"/>
+            <w:r>
+              <w:rPr>
+                <w:rFonts w:ascii="BRH Devanagari Extra" w:hAnsi="BRH Devanagari Extra" w:cs="BRH Devanagari Extra"/>
+                <w:color w:val="000000"/>
+                <w:sz w:val="40"/>
+                <w:szCs w:val="40"/>
+              </w:rPr>
+              <w:t>mÉÉqÉç</w:t>
+            </w:r>
+            <w:proofErr w:type="spellEnd"/>
+            <w:r>
+              <w:rPr>
+                <w:rFonts w:ascii="BRH Devanagari Extra" w:hAnsi="BRH Devanagari Extra" w:cs="BRH Devanagari Extra"/>
+                <w:color w:val="000000"/>
+                <w:sz w:val="40"/>
+                <w:szCs w:val="40"/>
+              </w:rPr>
+              <w:t xml:space="preserve"> |</w:t>
             </w:r>
           </w:p>
         </w:tc>
@@ -3348,6 +3908,7 @@
                 <w:szCs w:val="40"/>
               </w:rPr>
             </w:pPr>
+            <w:proofErr w:type="spellStart"/>
             <w:r>
               <w:rPr>
                 <w:rFonts w:ascii="BRH Devanagari Extra" w:hAnsi="BRH Devanagari Extra" w:cs="BRH Devanagari Extra"/>
@@ -3367,6 +3928,7 @@
               </w:rPr>
               <w:t>cN</w:t>
             </w:r>
+            <w:proofErr w:type="spellEnd"/>
             <w:r>
               <w:rPr>
                 <w:rFonts w:ascii="BRH Malayalam Extra" w:hAnsi="BRH Malayalam Extra" w:cs="BRH Malayalam Extra"/>
@@ -3573,25 +4135,37 @@
               </w:rPr>
               <w:t>–</w:t>
             </w:r>
-            <w:r>
-              <w:rPr>
-                <w:rFonts w:ascii="BRH Devanagari Extra" w:hAnsi="BRH Devanagari Extra" w:cs="BRH Devanagari Extra"/>
-                <w:color w:val="000000"/>
-                <w:sz w:val="40"/>
-                <w:szCs w:val="40"/>
-              </w:rPr>
-              <w:t>iÉÉqÉç | L</w:t>
-            </w:r>
-            <w:r>
-              <w:rPr>
-                <w:rFonts w:ascii="BRH Malayalam Extra" w:hAnsi="BRH Malayalam Extra" w:cs="BRH Devanagari Extra"/>
-                <w:b/>
-                <w:color w:val="000000"/>
-                <w:sz w:val="32"/>
-                <w:szCs w:val="40"/>
-              </w:rPr>
-              <w:t>–</w:t>
-            </w:r>
+            <w:proofErr w:type="spellStart"/>
+            <w:r>
+              <w:rPr>
+                <w:rFonts w:ascii="BRH Devanagari Extra" w:hAnsi="BRH Devanagari Extra" w:cs="BRH Devanagari Extra"/>
+                <w:color w:val="000000"/>
+                <w:sz w:val="40"/>
+                <w:szCs w:val="40"/>
+              </w:rPr>
+              <w:t>iÉÉqÉç</w:t>
+            </w:r>
+            <w:proofErr w:type="spellEnd"/>
+            <w:r>
+              <w:rPr>
+                <w:rFonts w:ascii="BRH Devanagari Extra" w:hAnsi="BRH Devanagari Extra" w:cs="BRH Devanagari Extra"/>
+                <w:color w:val="000000"/>
+                <w:sz w:val="40"/>
+                <w:szCs w:val="40"/>
+              </w:rPr>
+              <w:t xml:space="preserve"> | L</w:t>
+            </w:r>
+            <w:r>
+              <w:rPr>
+                <w:rFonts w:ascii="BRH Malayalam Extra" w:hAnsi="BRH Malayalam Extra" w:cs="BRH Devanagari Extra"/>
+                <w:b/>
+                <w:color w:val="000000"/>
+                <w:sz w:val="32"/>
+                <w:szCs w:val="40"/>
+              </w:rPr>
+              <w:t>–</w:t>
+            </w:r>
+            <w:proofErr w:type="spellStart"/>
             <w:r>
               <w:rPr>
                 <w:rFonts w:ascii="BRH Devanagari Extra" w:hAnsi="BRH Devanagari Extra" w:cs="BRH Devanagari Extra"/>
@@ -3611,24 +4185,36 @@
               </w:rPr>
               <w:t>qÉÉÿÍµÉ</w:t>
             </w:r>
-            <w:r>
-              <w:rPr>
-                <w:rFonts w:ascii="BRH Malayalam Extra" w:hAnsi="BRH Malayalam Extra" w:cs="BRH Devanagari Extra"/>
-                <w:b/>
-                <w:color w:val="000000"/>
-                <w:sz w:val="32"/>
-                <w:szCs w:val="40"/>
-              </w:rPr>
-              <w:t>–</w:t>
-            </w:r>
-            <w:r>
-              <w:rPr>
-                <w:rFonts w:ascii="BRH Devanagari Extra" w:hAnsi="BRH Devanagari Extra" w:cs="BRH Devanagari Extra"/>
-                <w:color w:val="000000"/>
-                <w:sz w:val="40"/>
-                <w:szCs w:val="40"/>
-              </w:rPr>
-              <w:t>lÉÏqÉç |</w:t>
+            <w:proofErr w:type="spellEnd"/>
+            <w:r>
+              <w:rPr>
+                <w:rFonts w:ascii="BRH Malayalam Extra" w:hAnsi="BRH Malayalam Extra" w:cs="BRH Devanagari Extra"/>
+                <w:b/>
+                <w:color w:val="000000"/>
+                <w:sz w:val="32"/>
+                <w:szCs w:val="40"/>
+              </w:rPr>
+              <w:t>–</w:t>
+            </w:r>
+            <w:proofErr w:type="spellStart"/>
+            <w:r>
+              <w:rPr>
+                <w:rFonts w:ascii="BRH Devanagari Extra" w:hAnsi="BRH Devanagari Extra" w:cs="BRH Devanagari Extra"/>
+                <w:color w:val="000000"/>
+                <w:sz w:val="40"/>
+                <w:szCs w:val="40"/>
+              </w:rPr>
+              <w:t>lÉÏqÉç</w:t>
+            </w:r>
+            <w:proofErr w:type="spellEnd"/>
+            <w:r>
+              <w:rPr>
+                <w:rFonts w:ascii="BRH Devanagari Extra" w:hAnsi="BRH Devanagari Extra" w:cs="BRH Devanagari Extra"/>
+                <w:color w:val="000000"/>
+                <w:sz w:val="40"/>
+                <w:szCs w:val="40"/>
+              </w:rPr>
+              <w:t xml:space="preserve"> |</w:t>
             </w:r>
             <w:r>
               <w:rPr>
@@ -3694,33 +4280,66 @@
               </w:rPr>
               <w:t>–</w:t>
             </w:r>
-            <w:r>
-              <w:rPr>
-                <w:rFonts w:ascii="BRH Devanagari Extra" w:hAnsi="BRH Devanagari Extra" w:cs="BRH Devanagari Extra"/>
-                <w:color w:val="000000"/>
-                <w:sz w:val="40"/>
-                <w:szCs w:val="40"/>
-              </w:rPr>
-              <w:t>lÉÏqÉç ÆrÉ</w:t>
-            </w:r>
-            <w:r>
-              <w:rPr>
-                <w:rFonts w:ascii="BRH Malayalam Extra" w:hAnsi="BRH Malayalam Extra" w:cs="BRH Devanagari Extra"/>
-                <w:b/>
-                <w:color w:val="000000"/>
-                <w:sz w:val="32"/>
-                <w:szCs w:val="40"/>
-              </w:rPr>
-              <w:t>–</w:t>
-            </w:r>
-            <w:r>
-              <w:rPr>
-                <w:rFonts w:ascii="BRH Devanagari Extra" w:hAnsi="BRH Devanagari Extra" w:cs="BRH Devanagari Extra"/>
-                <w:color w:val="000000"/>
-                <w:sz w:val="40"/>
-                <w:szCs w:val="40"/>
-              </w:rPr>
-              <w:t>qÉÏqÉç |</w:t>
+            <w:proofErr w:type="spellStart"/>
+            <w:r>
+              <w:rPr>
+                <w:rFonts w:ascii="BRH Devanagari Extra" w:hAnsi="BRH Devanagari Extra" w:cs="BRH Devanagari Extra"/>
+                <w:color w:val="000000"/>
+                <w:sz w:val="40"/>
+                <w:szCs w:val="40"/>
+              </w:rPr>
+              <w:t>lÉÏqÉç</w:t>
+            </w:r>
+            <w:proofErr w:type="spellEnd"/>
+            <w:r>
+              <w:rPr>
+                <w:rFonts w:ascii="BRH Devanagari Extra" w:hAnsi="BRH Devanagari Extra" w:cs="BRH Devanagari Extra"/>
+                <w:color w:val="000000"/>
+                <w:sz w:val="40"/>
+                <w:szCs w:val="40"/>
+              </w:rPr>
+              <w:t xml:space="preserve"> </w:t>
+            </w:r>
+            <w:proofErr w:type="spellStart"/>
+            <w:r>
+              <w:rPr>
+                <w:rFonts w:ascii="BRH Devanagari Extra" w:hAnsi="BRH Devanagari Extra" w:cs="BRH Devanagari Extra"/>
+                <w:color w:val="000000"/>
+                <w:sz w:val="40"/>
+                <w:szCs w:val="40"/>
+              </w:rPr>
+              <w:t>ÆrÉ</w:t>
+            </w:r>
+            <w:proofErr w:type="spellEnd"/>
+            <w:r>
+              <w:rPr>
+                <w:rFonts w:ascii="BRH Malayalam Extra" w:hAnsi="BRH Malayalam Extra" w:cs="BRH Devanagari Extra"/>
+                <w:b/>
+                <w:color w:val="000000"/>
+                <w:sz w:val="32"/>
+                <w:szCs w:val="40"/>
+              </w:rPr>
+              <w:t>–</w:t>
+            </w:r>
+            <w:proofErr w:type="spellStart"/>
+            <w:r>
+              <w:rPr>
+                <w:rFonts w:ascii="BRH Devanagari Extra" w:hAnsi="BRH Devanagari Extra" w:cs="BRH Devanagari Extra"/>
+                <w:color w:val="000000"/>
+                <w:sz w:val="40"/>
+                <w:szCs w:val="40"/>
+              </w:rPr>
+              <w:t>qÉÏqÉç</w:t>
+            </w:r>
+            <w:proofErr w:type="spellEnd"/>
+            <w:r>
+              <w:rPr>
+                <w:rFonts w:ascii="BRH Devanagari Extra" w:hAnsi="BRH Devanagari Extra" w:cs="BRH Devanagari Extra"/>
+                <w:color w:val="000000"/>
+                <w:sz w:val="40"/>
+                <w:szCs w:val="40"/>
+              </w:rPr>
+              <w:t xml:space="preserve"> |</w:t>
             </w:r>
           </w:p>
         </w:tc>
@@ -3767,14 +4386,25 @@
               </w:rPr>
               <w:t>–</w:t>
             </w:r>
-            <w:r>
-              <w:rPr>
-                <w:rFonts w:ascii="BRH Devanagari Extra" w:hAnsi="BRH Devanagari Extra" w:cs="BRH Devanagari Extra"/>
-                <w:color w:val="000000"/>
-                <w:sz w:val="40"/>
-                <w:szCs w:val="40"/>
-              </w:rPr>
-              <w:t>iÉÉqÉç | L</w:t>
+            <w:proofErr w:type="spellStart"/>
+            <w:r>
+              <w:rPr>
+                <w:rFonts w:ascii="BRH Devanagari Extra" w:hAnsi="BRH Devanagari Extra" w:cs="BRH Devanagari Extra"/>
+                <w:color w:val="000000"/>
+                <w:sz w:val="40"/>
+                <w:szCs w:val="40"/>
+              </w:rPr>
+              <w:t>iÉÉqÉç</w:t>
+            </w:r>
+            <w:proofErr w:type="spellEnd"/>
+            <w:r>
+              <w:rPr>
+                <w:rFonts w:ascii="BRH Devanagari Extra" w:hAnsi="BRH Devanagari Extra" w:cs="BRH Devanagari Extra"/>
+                <w:color w:val="000000"/>
+                <w:sz w:val="40"/>
+                <w:szCs w:val="40"/>
+              </w:rPr>
+              <w:t xml:space="preserve"> | L</w:t>
             </w:r>
             <w:r>
               <w:rPr>
@@ -3787,6 +4417,7 @@
               </w:rPr>
               <w:t>–</w:t>
             </w:r>
+            <w:proofErr w:type="spellStart"/>
             <w:r>
               <w:rPr>
                 <w:rFonts w:ascii="BRH Devanagari Extra" w:hAnsi="BRH Devanagari Extra" w:cs="BRH Devanagari Extra"/>
@@ -3806,24 +4437,36 @@
               </w:rPr>
               <w:t>qÉÉÿÍµÉ</w:t>
             </w:r>
-            <w:r>
-              <w:rPr>
-                <w:rFonts w:ascii="BRH Malayalam Extra" w:hAnsi="BRH Malayalam Extra" w:cs="BRH Devanagari Extra"/>
-                <w:b/>
-                <w:color w:val="000000"/>
-                <w:sz w:val="32"/>
-                <w:szCs w:val="40"/>
-              </w:rPr>
-              <w:t>–</w:t>
-            </w:r>
-            <w:r>
-              <w:rPr>
-                <w:rFonts w:ascii="BRH Devanagari Extra" w:hAnsi="BRH Devanagari Extra" w:cs="BRH Devanagari Extra"/>
-                <w:color w:val="000000"/>
-                <w:sz w:val="40"/>
-                <w:szCs w:val="40"/>
-              </w:rPr>
-              <w:t>lÉÏqÉç |</w:t>
+            <w:proofErr w:type="spellEnd"/>
+            <w:r>
+              <w:rPr>
+                <w:rFonts w:ascii="BRH Malayalam Extra" w:hAnsi="BRH Malayalam Extra" w:cs="BRH Devanagari Extra"/>
+                <w:b/>
+                <w:color w:val="000000"/>
+                <w:sz w:val="32"/>
+                <w:szCs w:val="40"/>
+              </w:rPr>
+              <w:t>–</w:t>
+            </w:r>
+            <w:proofErr w:type="spellStart"/>
+            <w:r>
+              <w:rPr>
+                <w:rFonts w:ascii="BRH Devanagari Extra" w:hAnsi="BRH Devanagari Extra" w:cs="BRH Devanagari Extra"/>
+                <w:color w:val="000000"/>
+                <w:sz w:val="40"/>
+                <w:szCs w:val="40"/>
+              </w:rPr>
+              <w:t>lÉÏqÉç</w:t>
+            </w:r>
+            <w:proofErr w:type="spellEnd"/>
+            <w:r>
+              <w:rPr>
+                <w:rFonts w:ascii="BRH Devanagari Extra" w:hAnsi="BRH Devanagari Extra" w:cs="BRH Devanagari Extra"/>
+                <w:color w:val="000000"/>
+                <w:sz w:val="40"/>
+                <w:szCs w:val="40"/>
+              </w:rPr>
+              <w:t xml:space="preserve"> |</w:t>
             </w:r>
             <w:r>
               <w:rPr>
@@ -3888,34 +4531,82 @@
               </w:rPr>
               <w:t>–</w:t>
             </w:r>
-            <w:r>
-              <w:rPr>
-                <w:rFonts w:ascii="BRH Devanagari Extra" w:hAnsi="BRH Devanagari Extra" w:cs="BRH Devanagari Extra"/>
-                <w:color w:val="000000"/>
-                <w:sz w:val="40"/>
-                <w:szCs w:val="40"/>
-              </w:rPr>
-              <w:t>lÉÏqÉç ÆrÉ</w:t>
-            </w:r>
-            <w:r>
-              <w:rPr>
-                <w:rFonts w:ascii="BRH Malayalam Extra" w:hAnsi="BRH Malayalam Extra" w:cs="BRH Devanagari Extra"/>
-                <w:b/>
-                <w:color w:val="000000"/>
-                <w:sz w:val="32"/>
-                <w:szCs w:val="40"/>
-              </w:rPr>
-              <w:t>–</w:t>
-            </w:r>
-            <w:r>
-              <w:rPr>
-                <w:rFonts w:ascii="BRH Devanagari Extra" w:hAnsi="BRH Devanagari Extra" w:cs="BRH Devanagari Extra"/>
-                <w:color w:val="000000"/>
-                <w:sz w:val="40"/>
-                <w:szCs w:val="40"/>
-              </w:rPr>
-              <w:t>qÉÏqÉç |</w:t>
-            </w:r>
+            <w:proofErr w:type="spellStart"/>
+            <w:r>
+              <w:rPr>
+                <w:rFonts w:ascii="BRH Devanagari Extra" w:hAnsi="BRH Devanagari Extra" w:cs="BRH Devanagari Extra"/>
+                <w:color w:val="000000"/>
+                <w:sz w:val="40"/>
+                <w:szCs w:val="40"/>
+              </w:rPr>
+              <w:t>lÉÏqÉç</w:t>
+            </w:r>
+            <w:proofErr w:type="spellEnd"/>
+            <w:r>
+              <w:rPr>
+                <w:rFonts w:ascii="BRH Devanagari Extra" w:hAnsi="BRH Devanagari Extra" w:cs="BRH Devanagari Extra"/>
+                <w:color w:val="000000"/>
+                <w:sz w:val="40"/>
+                <w:szCs w:val="40"/>
+              </w:rPr>
+              <w:t xml:space="preserve"> </w:t>
+            </w:r>
+            <w:proofErr w:type="spellStart"/>
+            <w:r>
+              <w:rPr>
+                <w:rFonts w:ascii="BRH Devanagari Extra" w:hAnsi="BRH Devanagari Extra" w:cs="BRH Devanagari Extra"/>
+                <w:color w:val="000000"/>
+                <w:sz w:val="40"/>
+                <w:szCs w:val="40"/>
+              </w:rPr>
+              <w:t>ÆrÉ</w:t>
+            </w:r>
+            <w:proofErr w:type="spellEnd"/>
+            <w:r>
+              <w:rPr>
+                <w:rFonts w:ascii="BRH Malayalam Extra" w:hAnsi="BRH Malayalam Extra" w:cs="BRH Devanagari Extra"/>
+                <w:b/>
+                <w:color w:val="000000"/>
+                <w:sz w:val="32"/>
+                <w:szCs w:val="40"/>
+              </w:rPr>
+              <w:t>–</w:t>
+            </w:r>
+            <w:proofErr w:type="spellStart"/>
+            <w:r>
+              <w:rPr>
+                <w:rFonts w:ascii="BRH Devanagari Extra" w:hAnsi="BRH Devanagari Extra" w:cs="BRH Devanagari Extra"/>
+                <w:color w:val="000000"/>
+                <w:sz w:val="40"/>
+                <w:szCs w:val="40"/>
+              </w:rPr>
+              <w:t>qÉÏqÉç</w:t>
+            </w:r>
+            <w:proofErr w:type="spellEnd"/>
+            <w:r>
+              <w:rPr>
+                <w:rFonts w:ascii="BRH Devanagari Extra" w:hAnsi="BRH Devanagari Extra" w:cs="BRH Devanagari Extra"/>
+                <w:color w:val="000000"/>
+                <w:sz w:val="40"/>
+                <w:szCs w:val="40"/>
+              </w:rPr>
+              <w:t xml:space="preserve"> |</w:t>
+            </w:r>
+          </w:p>
+          <w:p>
+            <w:pPr>
+              <w:widowControl w:val="0"/>
+              <w:autoSpaceDE w:val="0"/>
+              <w:autoSpaceDN w:val="0"/>
+              <w:adjustRightInd w:val="0"/>
+              <w:spacing w:before="0" w:line="240" w:lineRule="auto"/>
+              <w:rPr>
+                <w:rFonts w:ascii="BRH Devanagari Extra" w:hAnsi="BRH Devanagari Extra" w:cs="BRH Devanagari Extra"/>
+                <w:color w:val="000000"/>
+                <w:sz w:val="40"/>
+                <w:szCs w:val="40"/>
+              </w:rPr>
+            </w:pPr>
           </w:p>
         </w:tc>
       </w:tr>
@@ -3956,6 +4647,7 @@
                 <w:szCs w:val="28"/>
                 <w:lang w:val="it-IT"/>
               </w:rPr>
+              <w:lastRenderedPageBreak/>
               <w:t>TS 2.1.11.2 - Kramam</w:t>
             </w:r>
           </w:p>
@@ -4029,6 +4721,7 @@
                 <w:szCs w:val="40"/>
               </w:rPr>
             </w:pPr>
+            <w:proofErr w:type="spellStart"/>
             <w:r>
               <w:rPr>
                 <w:rFonts w:ascii="BRH Devanagari Extra" w:hAnsi="BRH Devanagari Extra" w:cs="BRH Devanagari Extra"/>
@@ -4038,16 +4731,18 @@
               </w:rPr>
               <w:t>M×ü</w:t>
             </w:r>
-            <w:r>
-              <w:rPr>
-                <w:rFonts w:ascii="BRH Malayalam Extra" w:hAnsi="BRH Malayalam Extra" w:cs="BRH Devanagari Extra"/>
-                <w:b/>
-                <w:color w:val="000000"/>
-                <w:sz w:val="32"/>
-                <w:szCs w:val="40"/>
-              </w:rPr>
-              <w:t>–</w:t>
-            </w:r>
+            <w:proofErr w:type="spellEnd"/>
+            <w:r>
+              <w:rPr>
+                <w:rFonts w:ascii="BRH Malayalam Extra" w:hAnsi="BRH Malayalam Extra" w:cs="BRH Devanagari Extra"/>
+                <w:b/>
+                <w:color w:val="000000"/>
+                <w:sz w:val="32"/>
+                <w:szCs w:val="40"/>
+              </w:rPr>
+              <w:t>–</w:t>
+            </w:r>
+            <w:proofErr w:type="spellStart"/>
             <w:r>
               <w:rPr>
                 <w:rFonts w:ascii="BRH Devanagari Extra" w:hAnsi="BRH Devanagari Extra" w:cs="BRH Devanagari Extra"/>
@@ -4057,16 +4752,18 @@
               </w:rPr>
               <w:t>hÉÉå</w:t>
             </w:r>
-            <w:r>
-              <w:rPr>
-                <w:rFonts w:ascii="BRH Malayalam Extra" w:hAnsi="BRH Malayalam Extra" w:cs="BRH Devanagari Extra"/>
-                <w:b/>
-                <w:color w:val="000000"/>
-                <w:sz w:val="32"/>
-                <w:szCs w:val="40"/>
-              </w:rPr>
-              <w:t>–</w:t>
-            </w:r>
+            <w:proofErr w:type="spellEnd"/>
+            <w:r>
+              <w:rPr>
+                <w:rFonts w:ascii="BRH Malayalam Extra" w:hAnsi="BRH Malayalam Extra" w:cs="BRH Devanagari Extra"/>
+                <w:b/>
+                <w:color w:val="000000"/>
+                <w:sz w:val="32"/>
+                <w:szCs w:val="40"/>
+              </w:rPr>
+              <w:t>–</w:t>
+            </w:r>
+            <w:proofErr w:type="spellStart"/>
             <w:r>
               <w:rPr>
                 <w:rFonts w:ascii="BRH Devanagari Extra" w:hAnsi="BRH Devanagari Extra" w:cs="BRH Devanagari Extra"/>
@@ -4076,6 +4773,7 @@
               </w:rPr>
               <w:t>iuÉÉ</w:t>
             </w:r>
+            <w:proofErr w:type="spellEnd"/>
             <w:r>
               <w:rPr>
                 <w:rFonts w:ascii="BRH Malayalam Extra" w:hAnsi="BRH Malayalam Extra" w:cs="BRH Devanagari Extra"/>
@@ -4105,6 +4803,7 @@
               </w:rPr>
               <w:t>–</w:t>
             </w:r>
+            <w:proofErr w:type="spellStart"/>
             <w:r>
               <w:rPr>
                 <w:rFonts w:ascii="BRH Devanagari Extra" w:hAnsi="BRH Devanagari Extra" w:cs="BRH Devanagari Extra"/>
@@ -4122,7 +4821,17 @@
                 <w:sz w:val="40"/>
                 <w:szCs w:val="40"/>
               </w:rPr>
-              <w:t>æÈ | AÉ</w:t>
+              <w:t>æÈ</w:t>
+            </w:r>
+            <w:proofErr w:type="spellEnd"/>
+            <w:r>
+              <w:rPr>
+                <w:rFonts w:ascii="BRH Devanagari Extra" w:hAnsi="BRH Devanagari Extra" w:cs="BRH Devanagari Extra"/>
+                <w:color w:val="000000"/>
+                <w:sz w:val="40"/>
+                <w:szCs w:val="40"/>
+              </w:rPr>
+              <w:t xml:space="preserve"> | AÉ</w:t>
             </w:r>
             <w:r>
               <w:rPr>
@@ -4153,14 +4862,45 @@
               </w:rPr>
               <w:t>–</w:t>
             </w:r>
-            <w:r>
-              <w:rPr>
-                <w:rFonts w:ascii="BRH Devanagari Extra" w:hAnsi="BRH Devanagari Extra" w:cs="BRH Devanagari Extra"/>
-                <w:color w:val="000000"/>
-                <w:sz w:val="40"/>
-                <w:szCs w:val="40"/>
-              </w:rPr>
-              <w:t>irÉæUç lÉþÈ |</w:t>
+            <w:proofErr w:type="spellStart"/>
+            <w:r>
+              <w:rPr>
+                <w:rFonts w:ascii="BRH Devanagari Extra" w:hAnsi="BRH Devanagari Extra" w:cs="BRH Devanagari Extra"/>
+                <w:color w:val="000000"/>
+                <w:sz w:val="40"/>
+                <w:szCs w:val="40"/>
+              </w:rPr>
+              <w:t>irÉæUç</w:t>
+            </w:r>
+            <w:proofErr w:type="spellEnd"/>
+            <w:r>
+              <w:rPr>
+                <w:rFonts w:ascii="BRH Devanagari Extra" w:hAnsi="BRH Devanagari Extra" w:cs="BRH Devanagari Extra"/>
+                <w:color w:val="000000"/>
+                <w:sz w:val="40"/>
+                <w:szCs w:val="40"/>
+              </w:rPr>
+              <w:t xml:space="preserve"> </w:t>
+            </w:r>
+            <w:proofErr w:type="spellStart"/>
+            <w:r>
+              <w:rPr>
+                <w:rFonts w:ascii="BRH Devanagari Extra" w:hAnsi="BRH Devanagari Extra" w:cs="BRH Devanagari Extra"/>
+                <w:color w:val="000000"/>
+                <w:sz w:val="40"/>
+                <w:szCs w:val="40"/>
+              </w:rPr>
+              <w:t>lÉþÈ</w:t>
+            </w:r>
+            <w:proofErr w:type="spellEnd"/>
+            <w:r>
+              <w:rPr>
+                <w:rFonts w:ascii="BRH Devanagari Extra" w:hAnsi="BRH Devanagari Extra" w:cs="BRH Devanagari Extra"/>
+                <w:color w:val="000000"/>
+                <w:sz w:val="40"/>
+                <w:szCs w:val="40"/>
+              </w:rPr>
+              <w:t xml:space="preserve"> |</w:t>
             </w:r>
           </w:p>
         </w:tc>
@@ -4188,6 +4928,7 @@
                 <w:szCs w:val="40"/>
               </w:rPr>
             </w:pPr>
+            <w:proofErr w:type="spellStart"/>
             <w:r>
               <w:rPr>
                 <w:rFonts w:ascii="BRH Devanagari Extra" w:hAnsi="BRH Devanagari Extra" w:cs="BRH Devanagari Extra"/>
@@ -4197,16 +4938,18 @@
               </w:rPr>
               <w:t>M×ü</w:t>
             </w:r>
-            <w:r>
-              <w:rPr>
-                <w:rFonts w:ascii="BRH Malayalam Extra" w:hAnsi="BRH Malayalam Extra" w:cs="BRH Devanagari Extra"/>
-                <w:b/>
-                <w:color w:val="000000"/>
-                <w:sz w:val="32"/>
-                <w:szCs w:val="40"/>
-              </w:rPr>
-              <w:t>–</w:t>
-            </w:r>
+            <w:proofErr w:type="spellEnd"/>
+            <w:r>
+              <w:rPr>
+                <w:rFonts w:ascii="BRH Malayalam Extra" w:hAnsi="BRH Malayalam Extra" w:cs="BRH Devanagari Extra"/>
+                <w:b/>
+                <w:color w:val="000000"/>
+                <w:sz w:val="32"/>
+                <w:szCs w:val="40"/>
+              </w:rPr>
+              <w:t>–</w:t>
+            </w:r>
+            <w:proofErr w:type="spellStart"/>
             <w:r>
               <w:rPr>
                 <w:rFonts w:ascii="BRH Devanagari Extra" w:hAnsi="BRH Devanagari Extra" w:cs="BRH Devanagari Extra"/>
@@ -4216,16 +4959,18 @@
               </w:rPr>
               <w:t>hÉÉå</w:t>
             </w:r>
-            <w:r>
-              <w:rPr>
-                <w:rFonts w:ascii="BRH Malayalam Extra" w:hAnsi="BRH Malayalam Extra" w:cs="BRH Devanagari Extra"/>
-                <w:b/>
-                <w:color w:val="000000"/>
-                <w:sz w:val="32"/>
-                <w:szCs w:val="40"/>
-              </w:rPr>
-              <w:t>–</w:t>
-            </w:r>
+            <w:proofErr w:type="spellEnd"/>
+            <w:r>
+              <w:rPr>
+                <w:rFonts w:ascii="BRH Malayalam Extra" w:hAnsi="BRH Malayalam Extra" w:cs="BRH Devanagari Extra"/>
+                <w:b/>
+                <w:color w:val="000000"/>
+                <w:sz w:val="32"/>
+                <w:szCs w:val="40"/>
+              </w:rPr>
+              <w:t>–</w:t>
+            </w:r>
+            <w:proofErr w:type="spellStart"/>
             <w:r>
               <w:rPr>
                 <w:rFonts w:ascii="BRH Devanagari Extra" w:hAnsi="BRH Devanagari Extra" w:cs="BRH Devanagari Extra"/>
@@ -4235,6 +4980,7 @@
               </w:rPr>
               <w:t>iuÉÉ</w:t>
             </w:r>
+            <w:proofErr w:type="spellEnd"/>
             <w:r>
               <w:rPr>
                 <w:rFonts w:ascii="BRH Malayalam Extra" w:hAnsi="BRH Malayalam Extra" w:cs="BRH Devanagari Extra"/>
@@ -4265,6 +5011,7 @@
               </w:rPr>
               <w:t>–</w:t>
             </w:r>
+            <w:proofErr w:type="spellStart"/>
             <w:r>
               <w:rPr>
                 <w:rFonts w:ascii="BRH Devanagari Extra" w:hAnsi="BRH Devanagari Extra" w:cs="BRH Devanagari Extra"/>
@@ -4275,6 +5022,7 @@
               </w:rPr>
               <w:t>irÉæÈ</w:t>
             </w:r>
+            <w:proofErr w:type="spellEnd"/>
             <w:r>
               <w:rPr>
                 <w:rFonts w:ascii="BRH Devanagari Extra" w:hAnsi="BRH Devanagari Extra" w:cs="BRH Devanagari Extra"/>
@@ -4313,14 +5061,45 @@
               </w:rPr>
               <w:t>–</w:t>
             </w:r>
-            <w:r>
-              <w:rPr>
-                <w:rFonts w:ascii="BRH Devanagari Extra" w:hAnsi="BRH Devanagari Extra" w:cs="BRH Devanagari Extra"/>
-                <w:color w:val="000000"/>
-                <w:sz w:val="40"/>
-                <w:szCs w:val="40"/>
-              </w:rPr>
-              <w:t>irÉæUç lÉþÈ |</w:t>
+            <w:proofErr w:type="spellStart"/>
+            <w:r>
+              <w:rPr>
+                <w:rFonts w:ascii="BRH Devanagari Extra" w:hAnsi="BRH Devanagari Extra" w:cs="BRH Devanagari Extra"/>
+                <w:color w:val="000000"/>
+                <w:sz w:val="40"/>
+                <w:szCs w:val="40"/>
+              </w:rPr>
+              <w:t>irÉæUç</w:t>
+            </w:r>
+            <w:proofErr w:type="spellEnd"/>
+            <w:r>
+              <w:rPr>
+                <w:rFonts w:ascii="BRH Devanagari Extra" w:hAnsi="BRH Devanagari Extra" w:cs="BRH Devanagari Extra"/>
+                <w:color w:val="000000"/>
+                <w:sz w:val="40"/>
+                <w:szCs w:val="40"/>
+              </w:rPr>
+              <w:t xml:space="preserve"> </w:t>
+            </w:r>
+            <w:proofErr w:type="spellStart"/>
+            <w:r>
+              <w:rPr>
+                <w:rFonts w:ascii="BRH Devanagari Extra" w:hAnsi="BRH Devanagari Extra" w:cs="BRH Devanagari Extra"/>
+                <w:color w:val="000000"/>
+                <w:sz w:val="40"/>
+                <w:szCs w:val="40"/>
+              </w:rPr>
+              <w:t>lÉþÈ</w:t>
+            </w:r>
+            <w:proofErr w:type="spellEnd"/>
+            <w:r>
+              <w:rPr>
+                <w:rFonts w:ascii="BRH Devanagari Extra" w:hAnsi="BRH Devanagari Extra" w:cs="BRH Devanagari Extra"/>
+                <w:color w:val="000000"/>
+                <w:sz w:val="40"/>
+                <w:szCs w:val="40"/>
+              </w:rPr>
+              <w:t xml:space="preserve"> |</w:t>
             </w:r>
           </w:p>
         </w:tc>
@@ -4347,54 +5126,6 @@
         </w:rPr>
         <w:t>==============</w:t>
       </w:r>
-    </w:p>
-    <w:p>
-      <w:pPr>
-        <w:jc w:val="center"/>
-        <w:rPr>
-          <w:b/>
-          <w:bCs/>
-          <w:sz w:val="32"/>
-          <w:szCs w:val="32"/>
-          <w:u w:val="single"/>
-        </w:rPr>
-      </w:pPr>
-    </w:p>
-    <w:p>
-      <w:pPr>
-        <w:jc w:val="center"/>
-        <w:rPr>
-          <w:b/>
-          <w:bCs/>
-          <w:sz w:val="32"/>
-          <w:szCs w:val="32"/>
-          <w:u w:val="single"/>
-        </w:rPr>
-      </w:pPr>
-    </w:p>
-    <w:p>
-      <w:pPr>
-        <w:jc w:val="center"/>
-        <w:rPr>
-          <w:b/>
-          <w:bCs/>
-          <w:sz w:val="32"/>
-          <w:szCs w:val="32"/>
-          <w:u w:val="single"/>
-        </w:rPr>
-      </w:pPr>
-    </w:p>
-    <w:p>
-      <w:pPr>
-        <w:jc w:val="center"/>
-        <w:rPr>
-          <w:b/>
-          <w:bCs/>
-          <w:sz w:val="32"/>
-          <w:szCs w:val="32"/>
-          <w:u w:val="single"/>
-        </w:rPr>
-      </w:pPr>
     </w:p>
     <w:p>
       <w:pPr>
@@ -4792,6 +5523,7 @@
               </w:rPr>
               <w:t>–</w:t>
             </w:r>
+            <w:proofErr w:type="spellStart"/>
             <w:r>
               <w:rPr>
                 <w:rFonts w:ascii="BRH Devanagari Extra" w:hAnsi="BRH Devanagari Extra" w:cs="BRH Devanagari Extra"/>
@@ -4801,16 +5533,18 @@
               </w:rPr>
               <w:t>cÉï</w:t>
             </w:r>
-            <w:r>
-              <w:rPr>
-                <w:rFonts w:ascii="BRH Malayalam Extra" w:hAnsi="BRH Malayalam Extra" w:cs="BRH Devanagari Extra"/>
-                <w:b/>
-                <w:color w:val="000000"/>
-                <w:sz w:val="32"/>
-                <w:szCs w:val="40"/>
-              </w:rPr>
-              <w:t>–</w:t>
-            </w:r>
+            <w:proofErr w:type="spellEnd"/>
+            <w:r>
+              <w:rPr>
+                <w:rFonts w:ascii="BRH Malayalam Extra" w:hAnsi="BRH Malayalam Extra" w:cs="BRH Devanagari Extra"/>
+                <w:b/>
+                <w:color w:val="000000"/>
+                <w:sz w:val="32"/>
+                <w:szCs w:val="40"/>
+              </w:rPr>
+              <w:t>–</w:t>
+            </w:r>
+            <w:proofErr w:type="spellStart"/>
             <w:r>
               <w:rPr>
                 <w:rFonts w:ascii="BRH Devanagari Extra" w:hAnsi="BRH Devanagari Extra" w:cs="BRH Devanagari Extra"/>
@@ -4820,24 +5554,45 @@
               </w:rPr>
               <w:t>xÉMüÉþqÉ</w:t>
             </w:r>
-            <w:r>
-              <w:rPr>
-                <w:rFonts w:ascii="BRH Malayalam Extra" w:hAnsi="BRH Malayalam Extra" w:cs="BRH Devanagari Extra"/>
-                <w:b/>
-                <w:color w:val="000000"/>
-                <w:sz w:val="32"/>
-                <w:szCs w:val="40"/>
-              </w:rPr>
-              <w:t>–</w:t>
-            </w:r>
-            <w:r>
-              <w:rPr>
-                <w:rFonts w:ascii="BRH Devanagari Extra" w:hAnsi="BRH Devanagari Extra" w:cs="BRH Devanagari Extra"/>
-                <w:color w:val="000000"/>
-                <w:sz w:val="40"/>
-                <w:szCs w:val="40"/>
-              </w:rPr>
-              <w:t xml:space="preserve">È xrÉÉiÉç | </w:t>
+            <w:proofErr w:type="spellEnd"/>
+            <w:r>
+              <w:rPr>
+                <w:rFonts w:ascii="BRH Malayalam Extra" w:hAnsi="BRH Malayalam Extra" w:cs="BRH Devanagari Extra"/>
+                <w:b/>
+                <w:color w:val="000000"/>
+                <w:sz w:val="32"/>
+                <w:szCs w:val="40"/>
+              </w:rPr>
+              <w:t>–</w:t>
+            </w:r>
+            <w:r>
+              <w:rPr>
+                <w:rFonts w:ascii="BRH Devanagari Extra" w:hAnsi="BRH Devanagari Extra" w:cs="BRH Devanagari Extra"/>
+                <w:color w:val="000000"/>
+                <w:sz w:val="40"/>
+                <w:szCs w:val="40"/>
+              </w:rPr>
+              <w:t xml:space="preserve">È </w:t>
+            </w:r>
+            <w:proofErr w:type="spellStart"/>
+            <w:r>
+              <w:rPr>
+                <w:rFonts w:ascii="BRH Devanagari Extra" w:hAnsi="BRH Devanagari Extra" w:cs="BRH Devanagari Extra"/>
+                <w:color w:val="000000"/>
+                <w:sz w:val="40"/>
+                <w:szCs w:val="40"/>
+              </w:rPr>
+              <w:t>xrÉÉiÉç</w:t>
+            </w:r>
+            <w:proofErr w:type="spellEnd"/>
+            <w:r>
+              <w:rPr>
+                <w:rFonts w:ascii="BRH Devanagari Extra" w:hAnsi="BRH Devanagari Extra" w:cs="BRH Devanagari Extra"/>
+                <w:color w:val="000000"/>
+                <w:sz w:val="40"/>
+                <w:szCs w:val="40"/>
+              </w:rPr>
+              <w:t xml:space="preserve"> | </w:t>
             </w:r>
           </w:p>
           <w:p>
@@ -4854,6 +5609,7 @@
                 <w:szCs w:val="40"/>
               </w:rPr>
             </w:pPr>
+            <w:proofErr w:type="spellStart"/>
             <w:r>
               <w:rPr>
                 <w:rFonts w:ascii="BRH Devanagari Extra" w:hAnsi="BRH Devanagari Extra" w:cs="BRH Devanagari Extra"/>
@@ -4863,6 +5619,7 @@
               </w:rPr>
               <w:t>oÉë</w:t>
             </w:r>
+            <w:proofErr w:type="spellEnd"/>
             <w:r>
               <w:rPr>
                 <w:rFonts w:ascii="BRH Malayalam Extra" w:hAnsi="BRH Malayalam Extra" w:cs="BRH Devanagari Extra"/>
@@ -4930,6 +5687,7 @@
               </w:rPr>
               <w:t>–</w:t>
             </w:r>
+            <w:proofErr w:type="spellStart"/>
             <w:r>
               <w:rPr>
                 <w:rFonts w:ascii="BRH Devanagari Extra" w:hAnsi="BRH Devanagari Extra" w:cs="BRH Devanagari Extra"/>
@@ -4939,24 +5697,45 @@
               </w:rPr>
               <w:t>ïxÉMüÉþqÉ</w:t>
             </w:r>
-            <w:r>
-              <w:rPr>
-                <w:rFonts w:ascii="BRH Malayalam Extra" w:hAnsi="BRH Malayalam Extra" w:cs="BRH Devanagari Extra"/>
-                <w:b/>
-                <w:color w:val="000000"/>
-                <w:sz w:val="32"/>
-                <w:szCs w:val="40"/>
-              </w:rPr>
-              <w:t>–</w:t>
-            </w:r>
-            <w:r>
-              <w:rPr>
-                <w:rFonts w:ascii="BRH Devanagari Extra" w:hAnsi="BRH Devanagari Extra" w:cs="BRH Devanagari Extra"/>
-                <w:color w:val="000000"/>
-                <w:sz w:val="40"/>
-                <w:szCs w:val="40"/>
-              </w:rPr>
-              <w:t xml:space="preserve"> CÌiÉþ </w:t>
+            <w:proofErr w:type="spellEnd"/>
+            <w:r>
+              <w:rPr>
+                <w:rFonts w:ascii="BRH Malayalam Extra" w:hAnsi="BRH Malayalam Extra" w:cs="BRH Devanagari Extra"/>
+                <w:b/>
+                <w:color w:val="000000"/>
+                <w:sz w:val="32"/>
+                <w:szCs w:val="40"/>
+              </w:rPr>
+              <w:t>–</w:t>
+            </w:r>
+            <w:r>
+              <w:rPr>
+                <w:rFonts w:ascii="BRH Devanagari Extra" w:hAnsi="BRH Devanagari Extra" w:cs="BRH Devanagari Extra"/>
+                <w:color w:val="000000"/>
+                <w:sz w:val="40"/>
+                <w:szCs w:val="40"/>
+              </w:rPr>
+              <w:t xml:space="preserve"> </w:t>
+            </w:r>
+            <w:proofErr w:type="spellStart"/>
+            <w:r>
+              <w:rPr>
+                <w:rFonts w:ascii="BRH Devanagari Extra" w:hAnsi="BRH Devanagari Extra" w:cs="BRH Devanagari Extra"/>
+                <w:color w:val="000000"/>
+                <w:sz w:val="40"/>
+                <w:szCs w:val="40"/>
+              </w:rPr>
+              <w:t>CÌiÉþ</w:t>
+            </w:r>
+            <w:proofErr w:type="spellEnd"/>
+            <w:r>
+              <w:rPr>
+                <w:rFonts w:ascii="BRH Devanagari Extra" w:hAnsi="BRH Devanagari Extra" w:cs="BRH Devanagari Extra"/>
+                <w:color w:val="000000"/>
+                <w:sz w:val="40"/>
+                <w:szCs w:val="40"/>
+              </w:rPr>
+              <w:t xml:space="preserve"> </w:t>
             </w:r>
           </w:p>
           <w:p>
@@ -5059,6 +5838,7 @@
                 <w:szCs w:val="40"/>
               </w:rPr>
             </w:pPr>
+            <w:proofErr w:type="spellStart"/>
             <w:r>
               <w:rPr>
                 <w:rFonts w:ascii="BRH Devanagari Extra" w:hAnsi="BRH Devanagari Extra" w:cs="BRH Devanagari Extra"/>
@@ -5078,6 +5858,7 @@
               </w:rPr>
               <w:t>ë</w:t>
             </w:r>
+            <w:proofErr w:type="spellEnd"/>
             <w:r>
               <w:rPr>
                 <w:rFonts w:ascii="BRH Malayalam Extra" w:hAnsi="BRH Malayalam Extra" w:cs="BRH Devanagari Extra"/>
@@ -5128,6 +5909,7 @@
               </w:rPr>
               <w:t>–</w:t>
             </w:r>
+            <w:proofErr w:type="spellStart"/>
             <w:r>
               <w:rPr>
                 <w:rFonts w:ascii="BRH Devanagari Extra" w:hAnsi="BRH Devanagari Extra" w:cs="BRH Devanagari Extra"/>
@@ -5137,16 +5919,18 @@
               </w:rPr>
               <w:t>cÉï</w:t>
             </w:r>
-            <w:r>
-              <w:rPr>
-                <w:rFonts w:ascii="BRH Malayalam Extra" w:hAnsi="BRH Malayalam Extra" w:cs="BRH Devanagari Extra"/>
-                <w:b/>
-                <w:color w:val="000000"/>
-                <w:sz w:val="32"/>
-                <w:szCs w:val="40"/>
-              </w:rPr>
-              <w:t>–</w:t>
-            </w:r>
+            <w:proofErr w:type="spellEnd"/>
+            <w:r>
+              <w:rPr>
+                <w:rFonts w:ascii="BRH Malayalam Extra" w:hAnsi="BRH Malayalam Extra" w:cs="BRH Devanagari Extra"/>
+                <w:b/>
+                <w:color w:val="000000"/>
+                <w:sz w:val="32"/>
+                <w:szCs w:val="40"/>
+              </w:rPr>
+              <w:t>–</w:t>
+            </w:r>
+            <w:proofErr w:type="spellStart"/>
             <w:r>
               <w:rPr>
                 <w:rFonts w:ascii="BRH Devanagari Extra" w:hAnsi="BRH Devanagari Extra" w:cs="BRH Devanagari Extra"/>
@@ -5156,24 +5940,45 @@
               </w:rPr>
               <w:t>xÉMüÉþqÉ</w:t>
             </w:r>
-            <w:r>
-              <w:rPr>
-                <w:rFonts w:ascii="BRH Malayalam Extra" w:hAnsi="BRH Malayalam Extra" w:cs="BRH Devanagari Extra"/>
-                <w:b/>
-                <w:color w:val="000000"/>
-                <w:sz w:val="32"/>
-                <w:szCs w:val="40"/>
-              </w:rPr>
-              <w:t>–</w:t>
-            </w:r>
-            <w:r>
-              <w:rPr>
-                <w:rFonts w:ascii="BRH Devanagari Extra" w:hAnsi="BRH Devanagari Extra" w:cs="BRH Devanagari Extra"/>
-                <w:color w:val="000000"/>
-                <w:sz w:val="40"/>
-                <w:szCs w:val="40"/>
-              </w:rPr>
-              <w:t xml:space="preserve">È xrÉÉiÉç | </w:t>
+            <w:proofErr w:type="spellEnd"/>
+            <w:r>
+              <w:rPr>
+                <w:rFonts w:ascii="BRH Malayalam Extra" w:hAnsi="BRH Malayalam Extra" w:cs="BRH Devanagari Extra"/>
+                <w:b/>
+                <w:color w:val="000000"/>
+                <w:sz w:val="32"/>
+                <w:szCs w:val="40"/>
+              </w:rPr>
+              <w:t>–</w:t>
+            </w:r>
+            <w:r>
+              <w:rPr>
+                <w:rFonts w:ascii="BRH Devanagari Extra" w:hAnsi="BRH Devanagari Extra" w:cs="BRH Devanagari Extra"/>
+                <w:color w:val="000000"/>
+                <w:sz w:val="40"/>
+                <w:szCs w:val="40"/>
+              </w:rPr>
+              <w:t xml:space="preserve">È </w:t>
+            </w:r>
+            <w:proofErr w:type="spellStart"/>
+            <w:r>
+              <w:rPr>
+                <w:rFonts w:ascii="BRH Devanagari Extra" w:hAnsi="BRH Devanagari Extra" w:cs="BRH Devanagari Extra"/>
+                <w:color w:val="000000"/>
+                <w:sz w:val="40"/>
+                <w:szCs w:val="40"/>
+              </w:rPr>
+              <w:t>xrÉÉiÉç</w:t>
+            </w:r>
+            <w:proofErr w:type="spellEnd"/>
+            <w:r>
+              <w:rPr>
+                <w:rFonts w:ascii="BRH Devanagari Extra" w:hAnsi="BRH Devanagari Extra" w:cs="BRH Devanagari Extra"/>
+                <w:color w:val="000000"/>
+                <w:sz w:val="40"/>
+                <w:szCs w:val="40"/>
+              </w:rPr>
+              <w:t xml:space="preserve"> | </w:t>
             </w:r>
           </w:p>
           <w:p>
@@ -5190,6 +5995,7 @@
                 <w:szCs w:val="40"/>
               </w:rPr>
             </w:pPr>
+            <w:proofErr w:type="spellStart"/>
             <w:r>
               <w:rPr>
                 <w:rFonts w:ascii="BRH Devanagari Extra" w:hAnsi="BRH Devanagari Extra" w:cs="BRH Devanagari Extra"/>
@@ -5199,6 +6005,7 @@
               </w:rPr>
               <w:t>oÉë</w:t>
             </w:r>
+            <w:proofErr w:type="spellEnd"/>
             <w:r>
               <w:rPr>
                 <w:rFonts w:ascii="BRH Malayalam Extra" w:hAnsi="BRH Malayalam Extra" w:cs="BRH Devanagari Extra"/>
@@ -5266,6 +6073,7 @@
               </w:rPr>
               <w:t>–</w:t>
             </w:r>
+            <w:proofErr w:type="spellStart"/>
             <w:r>
               <w:rPr>
                 <w:rFonts w:ascii="BRH Devanagari Extra" w:hAnsi="BRH Devanagari Extra" w:cs="BRH Devanagari Extra"/>
@@ -5275,24 +6083,45 @@
               </w:rPr>
               <w:t>ïxÉMüÉþqÉ</w:t>
             </w:r>
-            <w:r>
-              <w:rPr>
-                <w:rFonts w:ascii="BRH Malayalam Extra" w:hAnsi="BRH Malayalam Extra" w:cs="BRH Devanagari Extra"/>
-                <w:b/>
-                <w:color w:val="000000"/>
-                <w:sz w:val="32"/>
-                <w:szCs w:val="40"/>
-              </w:rPr>
-              <w:t>–</w:t>
-            </w:r>
-            <w:r>
-              <w:rPr>
-                <w:rFonts w:ascii="BRH Devanagari Extra" w:hAnsi="BRH Devanagari Extra" w:cs="BRH Devanagari Extra"/>
-                <w:color w:val="000000"/>
-                <w:sz w:val="40"/>
-                <w:szCs w:val="40"/>
-              </w:rPr>
-              <w:t xml:space="preserve"> CÌiÉþ </w:t>
+            <w:proofErr w:type="spellEnd"/>
+            <w:r>
+              <w:rPr>
+                <w:rFonts w:ascii="BRH Malayalam Extra" w:hAnsi="BRH Malayalam Extra" w:cs="BRH Devanagari Extra"/>
+                <w:b/>
+                <w:color w:val="000000"/>
+                <w:sz w:val="32"/>
+                <w:szCs w:val="40"/>
+              </w:rPr>
+              <w:t>–</w:t>
+            </w:r>
+            <w:r>
+              <w:rPr>
+                <w:rFonts w:ascii="BRH Devanagari Extra" w:hAnsi="BRH Devanagari Extra" w:cs="BRH Devanagari Extra"/>
+                <w:color w:val="000000"/>
+                <w:sz w:val="40"/>
+                <w:szCs w:val="40"/>
+              </w:rPr>
+              <w:t xml:space="preserve"> </w:t>
+            </w:r>
+            <w:proofErr w:type="spellStart"/>
+            <w:r>
+              <w:rPr>
+                <w:rFonts w:ascii="BRH Devanagari Extra" w:hAnsi="BRH Devanagari Extra" w:cs="BRH Devanagari Extra"/>
+                <w:color w:val="000000"/>
+                <w:sz w:val="40"/>
+                <w:szCs w:val="40"/>
+              </w:rPr>
+              <w:t>CÌiÉþ</w:t>
+            </w:r>
+            <w:proofErr w:type="spellEnd"/>
+            <w:r>
+              <w:rPr>
+                <w:rFonts w:ascii="BRH Devanagari Extra" w:hAnsi="BRH Devanagari Extra" w:cs="BRH Devanagari Extra"/>
+                <w:color w:val="000000"/>
+                <w:sz w:val="40"/>
+                <w:szCs w:val="40"/>
+              </w:rPr>
+              <w:t xml:space="preserve"> </w:t>
             </w:r>
           </w:p>
           <w:p>
@@ -5573,6 +6402,7 @@
                 <w:szCs w:val="40"/>
               </w:rPr>
             </w:pPr>
+            <w:proofErr w:type="spellStart"/>
             <w:r>
               <w:rPr>
                 <w:rFonts w:ascii="BRH Devanagari Extra" w:hAnsi="BRH Devanagari Extra" w:cs="BRH Devanagari Extra"/>
@@ -5582,24 +6412,35 @@
               </w:rPr>
               <w:t>AÉÌSþirÉÉxÉÉå</w:t>
             </w:r>
-            <w:r>
-              <w:rPr>
-                <w:rFonts w:ascii="BRH Malayalam Extra" w:hAnsi="BRH Malayalam Extra" w:cs="BRH Devanagari Extra"/>
-                <w:b/>
-                <w:color w:val="000000"/>
-                <w:sz w:val="32"/>
-                <w:szCs w:val="40"/>
-              </w:rPr>
-              <w:t>–</w:t>
-            </w:r>
-            <w:r>
-              <w:rPr>
-                <w:rFonts w:ascii="BRH Devanagari Extra" w:hAnsi="BRH Devanagari Extra" w:cs="BRH Devanagari Extra"/>
-                <w:color w:val="000000"/>
-                <w:sz w:val="40"/>
-                <w:szCs w:val="40"/>
-              </w:rPr>
-              <w:t xml:space="preserve"> pÉuÉþ</w:t>
+            <w:proofErr w:type="spellEnd"/>
+            <w:r>
+              <w:rPr>
+                <w:rFonts w:ascii="BRH Malayalam Extra" w:hAnsi="BRH Malayalam Extra" w:cs="BRH Devanagari Extra"/>
+                <w:b/>
+                <w:color w:val="000000"/>
+                <w:sz w:val="32"/>
+                <w:szCs w:val="40"/>
+              </w:rPr>
+              <w:t>–</w:t>
+            </w:r>
+            <w:r>
+              <w:rPr>
+                <w:rFonts w:ascii="BRH Devanagari Extra" w:hAnsi="BRH Devanagari Extra" w:cs="BRH Devanagari Extra"/>
+                <w:color w:val="000000"/>
+                <w:sz w:val="40"/>
+                <w:szCs w:val="40"/>
+              </w:rPr>
+              <w:t xml:space="preserve"> </w:t>
+            </w:r>
+            <w:proofErr w:type="spellStart"/>
+            <w:r>
+              <w:rPr>
+                <w:rFonts w:ascii="BRH Devanagari Extra" w:hAnsi="BRH Devanagari Extra" w:cs="BRH Devanagari Extra"/>
+                <w:color w:val="000000"/>
+                <w:sz w:val="40"/>
+                <w:szCs w:val="40"/>
+              </w:rPr>
+              <w:t>pÉuÉþ</w:t>
             </w:r>
             <w:r>
               <w:rPr>
@@ -5611,6 +6452,7 @@
               </w:rPr>
               <w:t>iÉ</w:t>
             </w:r>
+            <w:proofErr w:type="spellEnd"/>
             <w:r>
               <w:rPr>
                 <w:rFonts w:ascii="BRH Devanagari Extra" w:hAnsi="BRH Devanagari Extra" w:cs="BRH Devanagari Extra"/>
@@ -5636,38 +6478,86 @@
                 <w:lang w:bidi="ta-IN"/>
               </w:rPr>
             </w:pPr>
-            <w:r>
-              <w:rPr>
-                <w:rFonts w:ascii="BRH Devanagari Extra" w:hAnsi="BRH Devanagari Extra" w:cs="BRH Devanagari Extra"/>
-                <w:color w:val="000000"/>
-                <w:sz w:val="40"/>
-                <w:szCs w:val="40"/>
-              </w:rPr>
-              <w:t>pÉuÉþiÉÉ qÉ×Qû</w:t>
-            </w:r>
-            <w:r>
-              <w:rPr>
-                <w:rFonts w:ascii="BRH Malayalam Extra" w:hAnsi="BRH Malayalam Extra" w:cs="BRH Devanagari Extra"/>
-                <w:b/>
-                <w:color w:val="000000"/>
-                <w:sz w:val="32"/>
-                <w:szCs w:val="40"/>
-              </w:rPr>
-              <w:t>–</w:t>
-            </w:r>
-            <w:r>
-              <w:rPr>
-                <w:rFonts w:ascii="BRH Devanagari Extra" w:hAnsi="BRH Devanagari Extra" w:cs="BRH Devanagari Extra"/>
-                <w:color w:val="000000"/>
-                <w:sz w:val="40"/>
-                <w:szCs w:val="40"/>
-              </w:rPr>
-              <w:t>rÉliÉþÈ |</w:t>
+            <w:proofErr w:type="spellStart"/>
+            <w:r>
+              <w:rPr>
+                <w:rFonts w:ascii="BRH Devanagari Extra" w:hAnsi="BRH Devanagari Extra" w:cs="BRH Devanagari Extra"/>
+                <w:color w:val="000000"/>
+                <w:sz w:val="40"/>
+                <w:szCs w:val="40"/>
+              </w:rPr>
+              <w:t>pÉuÉþiÉÉ</w:t>
+            </w:r>
+            <w:proofErr w:type="spellEnd"/>
+            <w:r>
+              <w:rPr>
+                <w:rFonts w:ascii="BRH Devanagari Extra" w:hAnsi="BRH Devanagari Extra" w:cs="BRH Devanagari Extra"/>
+                <w:color w:val="000000"/>
+                <w:sz w:val="40"/>
+                <w:szCs w:val="40"/>
+              </w:rPr>
+              <w:t xml:space="preserve"> </w:t>
+            </w:r>
+            <w:proofErr w:type="spellStart"/>
+            <w:r>
+              <w:rPr>
+                <w:rFonts w:ascii="BRH Devanagari Extra" w:hAnsi="BRH Devanagari Extra" w:cs="BRH Devanagari Extra"/>
+                <w:color w:val="000000"/>
+                <w:sz w:val="40"/>
+                <w:szCs w:val="40"/>
+              </w:rPr>
+              <w:t>qÉ×Qû</w:t>
+            </w:r>
+            <w:proofErr w:type="spellEnd"/>
+            <w:r>
+              <w:rPr>
+                <w:rFonts w:ascii="BRH Malayalam Extra" w:hAnsi="BRH Malayalam Extra" w:cs="BRH Devanagari Extra"/>
+                <w:b/>
+                <w:color w:val="000000"/>
+                <w:sz w:val="32"/>
+                <w:szCs w:val="40"/>
+              </w:rPr>
+              <w:t>–</w:t>
+            </w:r>
+            <w:proofErr w:type="spellStart"/>
+            <w:r>
+              <w:rPr>
+                <w:rFonts w:ascii="BRH Devanagari Extra" w:hAnsi="BRH Devanagari Extra" w:cs="BRH Devanagari Extra"/>
+                <w:color w:val="000000"/>
+                <w:sz w:val="40"/>
+                <w:szCs w:val="40"/>
+              </w:rPr>
+              <w:t>rÉliÉþÈ</w:t>
+            </w:r>
+            <w:proofErr w:type="spellEnd"/>
+            <w:r>
+              <w:rPr>
+                <w:rFonts w:ascii="BRH Devanagari Extra" w:hAnsi="BRH Devanagari Extra" w:cs="BRH Devanagari Extra"/>
+                <w:color w:val="000000"/>
+                <w:sz w:val="40"/>
+                <w:szCs w:val="40"/>
+              </w:rPr>
+              <w:t xml:space="preserve"> |</w:t>
             </w:r>
           </w:p>
         </w:tc>
       </w:tr>
     </w:tbl>
+    <w:p>
+      <w:pPr>
+        <w:pBdr>
+          <w:bottom w:val="double" w:sz="6" w:space="1" w:color="auto"/>
+        </w:pBdr>
+        <w:jc w:val="center"/>
+        <w:rPr>
+          <w:b/>
+          <w:bCs/>
+          <w:sz w:val="32"/>
+          <w:szCs w:val="32"/>
+          <w:u w:val="single"/>
+        </w:rPr>
+      </w:pPr>
+    </w:p>
     <w:p>
       <w:pPr>
         <w:jc w:val="center"/>
@@ -5679,7 +6569,10 @@
           <w:u w:val="single"/>
         </w:rPr>
       </w:pPr>
-      <w:r>
+    </w:p>
+    <w:p>
+      <w:pPr>
+        <w:jc w:val="center"/>
         <w:rPr>
           <w:b/>
           <w:bCs/>
@@ -5687,8 +6580,7 @@
           <w:szCs w:val="32"/>
           <w:u w:val="single"/>
         </w:rPr>
-        <w:t>========================</w:t>
-      </w:r>
+      </w:pPr>
     </w:p>
     <w:p>
       <w:pPr>
@@ -5709,6 +6601,7 @@
           <w:szCs w:val="32"/>
           <w:u w:val="single"/>
         </w:rPr>
+        <w:lastRenderedPageBreak/>
         <w:t xml:space="preserve">TS </w:t>
       </w:r>
       <w:r>
@@ -5891,7 +6784,6 @@
                 <w:sz w:val="28"/>
                 <w:szCs w:val="28"/>
               </w:rPr>
-              <w:lastRenderedPageBreak/>
               <w:t>Reference</w:t>
             </w:r>
           </w:p>
@@ -5918,7 +6810,6 @@
                 <w:sz w:val="28"/>
                 <w:szCs w:val="28"/>
               </w:rPr>
-              <w:lastRenderedPageBreak/>
               <w:t>As Printed</w:t>
             </w:r>
           </w:p>
@@ -6201,6 +7092,7 @@
               </w:rPr>
               <w:t>–</w:t>
             </w:r>
+            <w:proofErr w:type="spellStart"/>
             <w:r>
               <w:rPr>
                 <w:rFonts w:ascii="BRH Devanagari Extra" w:hAnsi="BRH Devanagari Extra" w:cs="BRH Devanagari Extra"/>
@@ -6210,25 +7102,47 @@
               </w:rPr>
               <w:t>XçaÉëÉ</w:t>
             </w:r>
-            <w:r>
-              <w:rPr>
-                <w:rFonts w:ascii="BRH Malayalam Extra" w:hAnsi="BRH Malayalam Extra" w:cs="BRH Devanagari Extra"/>
-                <w:b/>
-                <w:color w:val="000000"/>
-                <w:sz w:val="32"/>
-                <w:szCs w:val="40"/>
-              </w:rPr>
-              <w:t>–</w:t>
-            </w:r>
-            <w:r>
-              <w:rPr>
-                <w:rFonts w:ascii="BRH Devanagari Extra" w:hAnsi="BRH Devanagari Extra" w:cs="BRH Devanagari Extra"/>
-                <w:color w:val="000000"/>
-                <w:sz w:val="40"/>
-                <w:szCs w:val="40"/>
-              </w:rPr>
-              <w:t xml:space="preserve">qÉ CÌiÉþ </w:t>
-            </w:r>
+            <w:proofErr w:type="spellEnd"/>
+            <w:r>
+              <w:rPr>
+                <w:rFonts w:ascii="BRH Malayalam Extra" w:hAnsi="BRH Malayalam Extra" w:cs="BRH Devanagari Extra"/>
+                <w:b/>
+                <w:color w:val="000000"/>
+                <w:sz w:val="32"/>
+                <w:szCs w:val="40"/>
+              </w:rPr>
+              <w:t>–</w:t>
+            </w:r>
+            <w:r>
+              <w:rPr>
+                <w:rFonts w:ascii="BRH Devanagari Extra" w:hAnsi="BRH Devanagari Extra" w:cs="BRH Devanagari Extra"/>
+                <w:color w:val="000000"/>
+                <w:sz w:val="40"/>
+                <w:szCs w:val="40"/>
+              </w:rPr>
+              <w:t xml:space="preserve">qÉ </w:t>
+            </w:r>
+            <w:proofErr w:type="spellStart"/>
+            <w:r>
+              <w:rPr>
+                <w:rFonts w:ascii="BRH Devanagari Extra" w:hAnsi="BRH Devanagari Extra" w:cs="BRH Devanagari Extra"/>
+                <w:color w:val="000000"/>
+                <w:sz w:val="40"/>
+                <w:szCs w:val="40"/>
+              </w:rPr>
+              <w:t>CÌiÉþ</w:t>
+            </w:r>
+            <w:proofErr w:type="spellEnd"/>
+            <w:r>
+              <w:rPr>
+                <w:rFonts w:ascii="BRH Devanagari Extra" w:hAnsi="BRH Devanagari Extra" w:cs="BRH Devanagari Extra"/>
+                <w:color w:val="000000"/>
+                <w:sz w:val="40"/>
+                <w:szCs w:val="40"/>
+              </w:rPr>
+              <w:t xml:space="preserve"> </w:t>
+            </w:r>
+            <w:proofErr w:type="spellStart"/>
             <w:r>
               <w:rPr>
                 <w:rFonts w:ascii="BRH Devanagari Extra" w:hAnsi="BRH Devanagari Extra" w:cs="BRH Devanagari Extra"/>
@@ -6237,19 +7151,20 @@
                 <w:szCs w:val="40"/>
                 <w:highlight w:val="green"/>
               </w:rPr>
-              <w:t>xÉqÉç - aÉëÉ</w:t>
-            </w:r>
-            <w:r>
-              <w:rPr>
-                <w:rFonts w:ascii="BRH Malayalam Extra" w:hAnsi="BRH Malayalam Extra" w:cs="BRH Devanagari Extra"/>
-                <w:b/>
-                <w:color w:val="000000"/>
-                <w:sz w:val="32"/>
+              <w:t>xÉqÉç</w:t>
+            </w:r>
+            <w:proofErr w:type="spellEnd"/>
+            <w:r>
+              <w:rPr>
+                <w:rFonts w:ascii="BRH Devanagari Extra" w:hAnsi="BRH Devanagari Extra" w:cs="BRH Devanagari Extra"/>
+                <w:color w:val="000000"/>
+                <w:sz w:val="40"/>
                 <w:szCs w:val="40"/>
                 <w:highlight w:val="green"/>
               </w:rPr>
-              <w:t>–</w:t>
-            </w:r>
+              <w:t xml:space="preserve"> - </w:t>
+            </w:r>
+            <w:proofErr w:type="spellStart"/>
             <w:r>
               <w:rPr>
                 <w:rFonts w:ascii="BRH Devanagari Extra" w:hAnsi="BRH Devanagari Extra" w:cs="BRH Devanagari Extra"/>
@@ -6258,8 +7173,32 @@
                 <w:szCs w:val="40"/>
                 <w:highlight w:val="green"/>
               </w:rPr>
+              <w:t>aÉëÉ</w:t>
+            </w:r>
+            <w:proofErr w:type="spellEnd"/>
+            <w:r>
+              <w:rPr>
+                <w:rFonts w:ascii="BRH Malayalam Extra" w:hAnsi="BRH Malayalam Extra" w:cs="BRH Devanagari Extra"/>
+                <w:b/>
+                <w:color w:val="000000"/>
+                <w:sz w:val="32"/>
+                <w:szCs w:val="40"/>
+                <w:highlight w:val="green"/>
+              </w:rPr>
+              <w:t>–</w:t>
+            </w:r>
+            <w:proofErr w:type="spellStart"/>
+            <w:r>
+              <w:rPr>
+                <w:rFonts w:ascii="BRH Devanagari Extra" w:hAnsi="BRH Devanagari Extra" w:cs="BRH Devanagari Extra"/>
+                <w:color w:val="000000"/>
+                <w:sz w:val="40"/>
+                <w:szCs w:val="40"/>
+                <w:highlight w:val="green"/>
+              </w:rPr>
               <w:t>qÉå</w:t>
             </w:r>
+            <w:proofErr w:type="spellEnd"/>
             <w:r>
               <w:rPr>
                 <w:rFonts w:ascii="BRH Devanagari Extra" w:hAnsi="BRH Devanagari Extra" w:cs="BRH Devanagari Extra"/>
@@ -6459,16 +7398,37 @@
                 <w:szCs w:val="40"/>
                 <w:highlight w:val="yellow"/>
               </w:rPr>
-              <w:t>§É</w:t>
-            </w:r>
-            <w:r>
-              <w:rPr>
-                <w:rFonts w:ascii="BRH Devanagari Extra" w:hAnsi="BRH Devanagari Extra" w:cs="BRH Devanagari Extra"/>
-                <w:color w:val="000000"/>
-                <w:sz w:val="40"/>
-                <w:szCs w:val="40"/>
-              </w:rPr>
-              <w:t>þrÉÈ - §É</w:t>
+              <w:t>§</w:t>
+            </w:r>
+            <w:proofErr w:type="spellStart"/>
+            <w:r>
+              <w:rPr>
+                <w:rFonts w:ascii="BRH Devanagari Extra" w:hAnsi="BRH Devanagari Extra" w:cs="BRH Devanagari Extra"/>
+                <w:color w:val="000000"/>
+                <w:sz w:val="40"/>
+                <w:szCs w:val="40"/>
+                <w:highlight w:val="yellow"/>
+              </w:rPr>
+              <w:t>É</w:t>
+            </w:r>
+            <w:r>
+              <w:rPr>
+                <w:rFonts w:ascii="BRH Devanagari Extra" w:hAnsi="BRH Devanagari Extra" w:cs="BRH Devanagari Extra"/>
+                <w:color w:val="000000"/>
+                <w:sz w:val="40"/>
+                <w:szCs w:val="40"/>
+              </w:rPr>
+              <w:t>þrÉÈ</w:t>
+            </w:r>
+            <w:proofErr w:type="spellEnd"/>
+            <w:r>
+              <w:rPr>
+                <w:rFonts w:ascii="BRH Devanagari Extra" w:hAnsi="BRH Devanagari Extra" w:cs="BRH Devanagari Extra"/>
+                <w:color w:val="000000"/>
+                <w:sz w:val="40"/>
+                <w:szCs w:val="40"/>
+              </w:rPr>
+              <w:t xml:space="preserve"> - §É</w:t>
             </w:r>
             <w:r>
               <w:rPr>
@@ -6535,46 +7495,79 @@
                 <w:sz w:val="40"/>
                 <w:szCs w:val="40"/>
               </w:rPr>
-              <w:t>§ÉrÉþx§ÉrÉ</w:t>
-            </w:r>
-            <w:r>
-              <w:rPr>
-                <w:rFonts w:ascii="BRH Malayalam Extra" w:hAnsi="BRH Malayalam Extra" w:cs="BRH Devanagari Extra"/>
-                <w:b/>
-                <w:color w:val="000000"/>
-                <w:sz w:val="32"/>
-                <w:szCs w:val="40"/>
-              </w:rPr>
-              <w:t>–</w:t>
-            </w:r>
-            <w:r>
-              <w:rPr>
-                <w:rFonts w:ascii="BRH Devanagari Extra" w:hAnsi="BRH Devanagari Extra" w:cs="BRH Devanagari Extra"/>
-                <w:color w:val="000000"/>
-                <w:sz w:val="40"/>
-                <w:szCs w:val="40"/>
-              </w:rPr>
-              <w:t xml:space="preserve"> AÉ | §ÉrÉþx§ÉrÉ</w:t>
-            </w:r>
-            <w:r>
-              <w:rPr>
-                <w:rFonts w:ascii="BRH Malayalam Extra" w:hAnsi="BRH Malayalam Extra" w:cs="BRH Devanagari Extra"/>
-                <w:b/>
-                <w:color w:val="000000"/>
-                <w:sz w:val="32"/>
-                <w:szCs w:val="40"/>
-              </w:rPr>
-              <w:t>–</w:t>
-            </w:r>
-            <w:r>
-              <w:rPr>
-                <w:rFonts w:ascii="BRH Devanagari Extra" w:hAnsi="BRH Devanagari Extra" w:cs="BRH Devanagari Extra"/>
-                <w:color w:val="000000"/>
-                <w:sz w:val="40"/>
-                <w:szCs w:val="40"/>
-              </w:rPr>
-              <w:t xml:space="preserve"> CÌiÉ</w:t>
-            </w:r>
+              <w:t>§</w:t>
+            </w:r>
+            <w:proofErr w:type="spellStart"/>
+            <w:r>
+              <w:rPr>
+                <w:rFonts w:ascii="BRH Devanagari Extra" w:hAnsi="BRH Devanagari Extra" w:cs="BRH Devanagari Extra"/>
+                <w:color w:val="000000"/>
+                <w:sz w:val="40"/>
+                <w:szCs w:val="40"/>
+              </w:rPr>
+              <w:t>ÉrÉþx§ÉrÉ</w:t>
+            </w:r>
+            <w:proofErr w:type="spellEnd"/>
+            <w:r>
+              <w:rPr>
+                <w:rFonts w:ascii="BRH Malayalam Extra" w:hAnsi="BRH Malayalam Extra" w:cs="BRH Devanagari Extra"/>
+                <w:b/>
+                <w:color w:val="000000"/>
+                <w:sz w:val="32"/>
+                <w:szCs w:val="40"/>
+              </w:rPr>
+              <w:t>–</w:t>
+            </w:r>
+            <w:r>
+              <w:rPr>
+                <w:rFonts w:ascii="BRH Devanagari Extra" w:hAnsi="BRH Devanagari Extra" w:cs="BRH Devanagari Extra"/>
+                <w:color w:val="000000"/>
+                <w:sz w:val="40"/>
+                <w:szCs w:val="40"/>
+              </w:rPr>
+              <w:t xml:space="preserve"> AÉ | §</w:t>
+            </w:r>
+            <w:proofErr w:type="spellStart"/>
+            <w:r>
+              <w:rPr>
+                <w:rFonts w:ascii="BRH Devanagari Extra" w:hAnsi="BRH Devanagari Extra" w:cs="BRH Devanagari Extra"/>
+                <w:color w:val="000000"/>
+                <w:sz w:val="40"/>
+                <w:szCs w:val="40"/>
+              </w:rPr>
+              <w:t>ÉrÉþx§ÉrÉ</w:t>
+            </w:r>
+            <w:proofErr w:type="spellEnd"/>
+            <w:r>
+              <w:rPr>
+                <w:rFonts w:ascii="BRH Malayalam Extra" w:hAnsi="BRH Malayalam Extra" w:cs="BRH Devanagari Extra"/>
+                <w:b/>
+                <w:color w:val="000000"/>
+                <w:sz w:val="32"/>
+                <w:szCs w:val="40"/>
+              </w:rPr>
+              <w:t>–</w:t>
+            </w:r>
+            <w:r>
+              <w:rPr>
+                <w:rFonts w:ascii="BRH Devanagari Extra" w:hAnsi="BRH Devanagari Extra" w:cs="BRH Devanagari Extra"/>
+                <w:color w:val="000000"/>
+                <w:sz w:val="40"/>
+                <w:szCs w:val="40"/>
+              </w:rPr>
+              <w:t xml:space="preserve"> </w:t>
+            </w:r>
+            <w:proofErr w:type="spellStart"/>
+            <w:r>
+              <w:rPr>
+                <w:rFonts w:ascii="BRH Devanagari Extra" w:hAnsi="BRH Devanagari Extra" w:cs="BRH Devanagari Extra"/>
+                <w:color w:val="000000"/>
+                <w:sz w:val="40"/>
+                <w:szCs w:val="40"/>
+              </w:rPr>
+              <w:t>CÌiÉ</w:t>
+            </w:r>
+            <w:proofErr w:type="spellEnd"/>
             <w:r>
               <w:rPr>
                 <w:rFonts w:ascii="BRH Malayalam Extra" w:hAnsi="BRH Malayalam Extra" w:cs="BRH Devanagari Extra"/>
@@ -6616,7 +7609,17 @@
                 <w:sz w:val="40"/>
                 <w:szCs w:val="40"/>
               </w:rPr>
-              <w:t>§É</w:t>
+              <w:t>§</w:t>
+            </w:r>
+            <w:proofErr w:type="spellStart"/>
+            <w:r>
+              <w:rPr>
+                <w:rFonts w:ascii="BRH Devanagari Extra" w:hAnsi="BRH Devanagari Extra" w:cs="BRH Devanagari Extra"/>
+                <w:color w:val="000000"/>
+                <w:sz w:val="40"/>
+                <w:szCs w:val="40"/>
+              </w:rPr>
+              <w:t>É</w:t>
             </w:r>
             <w:r>
               <w:rPr>
@@ -6635,7 +7638,17 @@
                 <w:sz w:val="40"/>
                 <w:szCs w:val="40"/>
               </w:rPr>
-              <w:t>þÈ - §É</w:t>
+              <w:t>þÈ</w:t>
+            </w:r>
+            <w:proofErr w:type="spellEnd"/>
+            <w:r>
+              <w:rPr>
+                <w:rFonts w:ascii="BRH Devanagari Extra" w:hAnsi="BRH Devanagari Extra" w:cs="BRH Devanagari Extra"/>
+                <w:color w:val="000000"/>
+                <w:sz w:val="40"/>
+                <w:szCs w:val="40"/>
+              </w:rPr>
+              <w:t xml:space="preserve"> - §É</w:t>
             </w:r>
             <w:r>
               <w:rPr>
@@ -7000,6 +8013,7 @@
               </w:rPr>
               <w:t>–</w:t>
             </w:r>
+            <w:proofErr w:type="spellStart"/>
             <w:r>
               <w:rPr>
                 <w:rFonts w:ascii="BRH Devanagari Extra" w:hAnsi="BRH Devanagari Extra" w:cs="BRH Devanagari Extra"/>
@@ -7009,24 +8023,36 @@
               </w:rPr>
               <w:t>cÉï</w:t>
             </w:r>
-            <w:r>
-              <w:rPr>
-                <w:rFonts w:ascii="BRH Malayalam Extra" w:hAnsi="BRH Malayalam Extra" w:cs="BRH Devanagari Extra"/>
-                <w:b/>
-                <w:color w:val="000000"/>
-                <w:sz w:val="32"/>
-                <w:szCs w:val="40"/>
-              </w:rPr>
-              <w:t>–</w:t>
-            </w:r>
-            <w:r>
-              <w:rPr>
-                <w:rFonts w:ascii="BRH Devanagari Extra" w:hAnsi="BRH Devanagari Extra" w:cs="BRH Devanagari Extra"/>
-                <w:color w:val="000000"/>
-                <w:sz w:val="40"/>
-                <w:szCs w:val="40"/>
-              </w:rPr>
-              <w:t>xrÉåþuÉ |</w:t>
+            <w:proofErr w:type="spellEnd"/>
+            <w:r>
+              <w:rPr>
+                <w:rFonts w:ascii="BRH Malayalam Extra" w:hAnsi="BRH Malayalam Extra" w:cs="BRH Devanagari Extra"/>
+                <w:b/>
+                <w:color w:val="000000"/>
+                <w:sz w:val="32"/>
+                <w:szCs w:val="40"/>
+              </w:rPr>
+              <w:t>–</w:t>
+            </w:r>
+            <w:proofErr w:type="spellStart"/>
+            <w:r>
+              <w:rPr>
+                <w:rFonts w:ascii="BRH Devanagari Extra" w:hAnsi="BRH Devanagari Extra" w:cs="BRH Devanagari Extra"/>
+                <w:color w:val="000000"/>
+                <w:sz w:val="40"/>
+                <w:szCs w:val="40"/>
+              </w:rPr>
+              <w:t>xrÉåþuÉ</w:t>
+            </w:r>
+            <w:proofErr w:type="spellEnd"/>
+            <w:r>
+              <w:rPr>
+                <w:rFonts w:ascii="BRH Devanagari Extra" w:hAnsi="BRH Devanagari Extra" w:cs="BRH Devanagari Extra"/>
+                <w:color w:val="000000"/>
+                <w:sz w:val="40"/>
+                <w:szCs w:val="40"/>
+              </w:rPr>
+              <w:t xml:space="preserve"> |</w:t>
             </w:r>
           </w:p>
         </w:tc>
@@ -7067,6 +8093,7 @@
               </w:rPr>
               <w:t>–</w:t>
             </w:r>
+            <w:proofErr w:type="spellStart"/>
             <w:r>
               <w:rPr>
                 <w:rFonts w:ascii="BRH Devanagari Extra" w:hAnsi="BRH Devanagari Extra" w:cs="BRH Devanagari Extra"/>
@@ -7076,16 +8103,18 @@
               </w:rPr>
               <w:t>cNû</w:t>
             </w:r>
-            <w:r>
-              <w:rPr>
-                <w:rFonts w:ascii="BRH Malayalam Extra" w:hAnsi="BRH Malayalam Extra" w:cs="BRH Devanagari Extra"/>
-                <w:b/>
-                <w:color w:val="000000"/>
-                <w:sz w:val="32"/>
-                <w:szCs w:val="40"/>
-              </w:rPr>
-              <w:t>–</w:t>
-            </w:r>
+            <w:proofErr w:type="spellEnd"/>
+            <w:r>
+              <w:rPr>
+                <w:rFonts w:ascii="BRH Malayalam Extra" w:hAnsi="BRH Malayalam Extra" w:cs="BRH Devanagari Extra"/>
+                <w:b/>
+                <w:color w:val="000000"/>
+                <w:sz w:val="32"/>
+                <w:szCs w:val="40"/>
+              </w:rPr>
+              <w:t>–</w:t>
+            </w:r>
+            <w:proofErr w:type="spellStart"/>
             <w:r>
               <w:rPr>
                 <w:rFonts w:ascii="BRH Devanagari Extra" w:hAnsi="BRH Devanagari Extra" w:cs="BRH Devanagari Extra"/>
@@ -7095,25 +8124,37 @@
               </w:rPr>
               <w:t>ÌiÉ</w:t>
             </w:r>
-            <w:r>
-              <w:rPr>
-                <w:rFonts w:ascii="BRH Malayalam Extra" w:hAnsi="BRH Malayalam Extra" w:cs="BRH Devanagari Extra"/>
-                <w:b/>
-                <w:color w:val="000000"/>
-                <w:sz w:val="32"/>
-                <w:szCs w:val="40"/>
-              </w:rPr>
-              <w:t>–</w:t>
-            </w:r>
-            <w:r>
-              <w:rPr>
-                <w:rFonts w:ascii="BRH Devanagari Extra" w:hAnsi="BRH Devanagari Extra" w:cs="BRH Devanagari Extra"/>
-                <w:color w:val="000000"/>
-                <w:sz w:val="40"/>
-                <w:szCs w:val="40"/>
-              </w:rPr>
-              <w:t xml:space="preserve"> oÉë</w:t>
-            </w:r>
+            <w:proofErr w:type="spellEnd"/>
+            <w:r>
+              <w:rPr>
+                <w:rFonts w:ascii="BRH Malayalam Extra" w:hAnsi="BRH Malayalam Extra" w:cs="BRH Devanagari Extra"/>
+                <w:b/>
+                <w:color w:val="000000"/>
+                <w:sz w:val="32"/>
+                <w:szCs w:val="40"/>
+              </w:rPr>
+              <w:t>–</w:t>
+            </w:r>
+            <w:r>
+              <w:rPr>
+                <w:rFonts w:ascii="BRH Devanagari Extra" w:hAnsi="BRH Devanagari Extra" w:cs="BRH Devanagari Extra"/>
+                <w:color w:val="000000"/>
+                <w:sz w:val="40"/>
+                <w:szCs w:val="40"/>
+              </w:rPr>
+              <w:t xml:space="preserve"> </w:t>
+            </w:r>
+            <w:proofErr w:type="spellStart"/>
+            <w:r>
+              <w:rPr>
+                <w:rFonts w:ascii="BRH Devanagari Extra" w:hAnsi="BRH Devanagari Extra" w:cs="BRH Devanagari Extra"/>
+                <w:color w:val="000000"/>
+                <w:sz w:val="40"/>
+                <w:szCs w:val="40"/>
+              </w:rPr>
+              <w:t>oÉë</w:t>
+            </w:r>
+            <w:proofErr w:type="spellEnd"/>
             <w:r>
               <w:rPr>
                 <w:rFonts w:ascii="BRH Malayalam Extra" w:hAnsi="BRH Malayalam Extra" w:cs="BRH Devanagari Extra"/>
@@ -7162,6 +8203,7 @@
               </w:rPr>
               <w:t>–</w:t>
             </w:r>
+            <w:proofErr w:type="spellStart"/>
             <w:r>
               <w:rPr>
                 <w:rFonts w:ascii="BRH Devanagari Extra" w:hAnsi="BRH Devanagari Extra" w:cs="BRH Devanagari Extra"/>
@@ -7171,6 +8213,7 @@
               </w:rPr>
               <w:t>cÉï</w:t>
             </w:r>
+            <w:proofErr w:type="spellEnd"/>
             <w:r>
               <w:rPr>
                 <w:rFonts w:ascii="BRH Malayalam Extra" w:hAnsi="BRH Malayalam Extra" w:cs="BRH Devanagari Extra"/>
@@ -7264,6 +8307,7 @@
               </w:rPr>
               <w:t>–</w:t>
             </w:r>
+            <w:proofErr w:type="spellStart"/>
             <w:r>
               <w:rPr>
                 <w:rFonts w:ascii="BRH Devanagari Extra" w:hAnsi="BRH Devanagari Extra" w:cs="BRH Devanagari Extra"/>
@@ -7273,24 +8317,36 @@
               </w:rPr>
               <w:t>cÉï</w:t>
             </w:r>
-            <w:r>
-              <w:rPr>
-                <w:rFonts w:ascii="BRH Malayalam Extra" w:hAnsi="BRH Malayalam Extra" w:cs="BRH Devanagari Extra"/>
-                <w:b/>
-                <w:color w:val="000000"/>
-                <w:sz w:val="32"/>
-                <w:szCs w:val="40"/>
-              </w:rPr>
-              <w:t>–</w:t>
-            </w:r>
-            <w:r>
-              <w:rPr>
-                <w:rFonts w:ascii="BRH Devanagari Extra" w:hAnsi="BRH Devanagari Extra" w:cs="BRH Devanagari Extra"/>
-                <w:color w:val="000000"/>
-                <w:sz w:val="40"/>
-                <w:szCs w:val="40"/>
-              </w:rPr>
-              <w:t>xrÉåþuÉ |</w:t>
+            <w:proofErr w:type="spellEnd"/>
+            <w:r>
+              <w:rPr>
+                <w:rFonts w:ascii="BRH Malayalam Extra" w:hAnsi="BRH Malayalam Extra" w:cs="BRH Devanagari Extra"/>
+                <w:b/>
+                <w:color w:val="000000"/>
+                <w:sz w:val="32"/>
+                <w:szCs w:val="40"/>
+              </w:rPr>
+              <w:t>–</w:t>
+            </w:r>
+            <w:proofErr w:type="spellStart"/>
+            <w:r>
+              <w:rPr>
+                <w:rFonts w:ascii="BRH Devanagari Extra" w:hAnsi="BRH Devanagari Extra" w:cs="BRH Devanagari Extra"/>
+                <w:color w:val="000000"/>
+                <w:sz w:val="40"/>
+                <w:szCs w:val="40"/>
+              </w:rPr>
+              <w:t>xrÉåþuÉ</w:t>
+            </w:r>
+            <w:proofErr w:type="spellEnd"/>
+            <w:r>
+              <w:rPr>
+                <w:rFonts w:ascii="BRH Devanagari Extra" w:hAnsi="BRH Devanagari Extra" w:cs="BRH Devanagari Extra"/>
+                <w:color w:val="000000"/>
+                <w:sz w:val="40"/>
+                <w:szCs w:val="40"/>
+              </w:rPr>
+              <w:t xml:space="preserve"> |</w:t>
             </w:r>
           </w:p>
         </w:tc>
@@ -7981,6 +9037,7 @@
                 <w:szCs w:val="28"/>
                 <w:lang w:val="it-IT"/>
               </w:rPr>
+              <w:lastRenderedPageBreak/>
               <w:t>TS 2.1.4.5</w:t>
             </w:r>
           </w:p>
@@ -8253,14 +9310,25 @@
               </w:rPr>
               <w:t>–</w:t>
             </w:r>
-            <w:r>
-              <w:rPr>
-                <w:rFonts w:ascii="BRH Devanagari Extra" w:hAnsi="BRH Devanagari Extra" w:cs="BRH Devanagari Extra"/>
-                <w:color w:val="000000"/>
-                <w:sz w:val="40"/>
-                <w:szCs w:val="40"/>
-              </w:rPr>
-              <w:t>uÉÉxrÉþ | A</w:t>
+            <w:proofErr w:type="spellStart"/>
+            <w:r>
+              <w:rPr>
+                <w:rFonts w:ascii="BRH Devanagari Extra" w:hAnsi="BRH Devanagari Extra" w:cs="BRH Devanagari Extra"/>
+                <w:color w:val="000000"/>
+                <w:sz w:val="40"/>
+                <w:szCs w:val="40"/>
+              </w:rPr>
+              <w:t>uÉÉxrÉþ</w:t>
+            </w:r>
+            <w:proofErr w:type="spellEnd"/>
+            <w:r>
+              <w:rPr>
+                <w:rFonts w:ascii="BRH Devanagari Extra" w:hAnsi="BRH Devanagari Extra" w:cs="BRH Devanagari Extra"/>
+                <w:color w:val="000000"/>
+                <w:sz w:val="40"/>
+                <w:szCs w:val="40"/>
+              </w:rPr>
+              <w:t xml:space="preserve"> | A</w:t>
             </w:r>
             <w:r>
               <w:rPr>
@@ -8273,6 +9341,7 @@
               </w:rPr>
               <w:t>–</w:t>
             </w:r>
+            <w:proofErr w:type="spellStart"/>
             <w:r>
               <w:rPr>
                 <w:rFonts w:ascii="BRH Devanagari Extra" w:hAnsi="BRH Devanagari Extra" w:cs="BRH Devanagari Extra"/>
@@ -8293,16 +9362,18 @@
               </w:rPr>
               <w:t>å</w:t>
             </w:r>
-            <w:r>
-              <w:rPr>
-                <w:rFonts w:ascii="BRH Malayalam Extra" w:hAnsi="BRH Malayalam Extra" w:cs="BRH Devanagari Extra"/>
-                <w:b/>
-                <w:color w:val="000000"/>
-                <w:sz w:val="32"/>
-                <w:szCs w:val="40"/>
-              </w:rPr>
-              <w:t>–</w:t>
-            </w:r>
+            <w:proofErr w:type="spellEnd"/>
+            <w:r>
+              <w:rPr>
+                <w:rFonts w:ascii="BRH Malayalam Extra" w:hAnsi="BRH Malayalam Extra" w:cs="BRH Devanagari Extra"/>
+                <w:b/>
+                <w:color w:val="000000"/>
+                <w:sz w:val="32"/>
+                <w:szCs w:val="40"/>
+              </w:rPr>
+              <w:t>–</w:t>
+            </w:r>
+            <w:proofErr w:type="spellStart"/>
             <w:r>
               <w:rPr>
                 <w:rFonts w:ascii="BRH Devanagari Extra" w:hAnsi="BRH Devanagari Extra" w:cs="BRH Devanagari Extra"/>
@@ -8312,24 +9383,36 @@
               </w:rPr>
               <w:t>ÎlSì</w:t>
             </w:r>
-            <w:r>
-              <w:rPr>
-                <w:rFonts w:ascii="BRH Malayalam Extra" w:hAnsi="BRH Malayalam Extra" w:cs="BRH Devanagari Extra"/>
-                <w:b/>
-                <w:color w:val="000000"/>
-                <w:sz w:val="32"/>
-                <w:szCs w:val="40"/>
-              </w:rPr>
-              <w:t>–</w:t>
-            </w:r>
-            <w:r>
-              <w:rPr>
-                <w:rFonts w:ascii="BRH Devanagari Extra" w:hAnsi="BRH Devanagari Extra" w:cs="BRH Devanagari Extra"/>
-                <w:color w:val="000000"/>
-                <w:sz w:val="40"/>
-                <w:szCs w:val="40"/>
-              </w:rPr>
-              <w:t xml:space="preserve">rÉqÉç | </w:t>
+            <w:proofErr w:type="spellEnd"/>
+            <w:r>
+              <w:rPr>
+                <w:rFonts w:ascii="BRH Malayalam Extra" w:hAnsi="BRH Malayalam Extra" w:cs="BRH Devanagari Extra"/>
+                <w:b/>
+                <w:color w:val="000000"/>
+                <w:sz w:val="32"/>
+                <w:szCs w:val="40"/>
+              </w:rPr>
+              <w:t>–</w:t>
+            </w:r>
+            <w:proofErr w:type="spellStart"/>
+            <w:r>
+              <w:rPr>
+                <w:rFonts w:ascii="BRH Devanagari Extra" w:hAnsi="BRH Devanagari Extra" w:cs="BRH Devanagari Extra"/>
+                <w:color w:val="000000"/>
+                <w:sz w:val="40"/>
+                <w:szCs w:val="40"/>
+              </w:rPr>
+              <w:t>rÉqÉç</w:t>
+            </w:r>
+            <w:proofErr w:type="spellEnd"/>
+            <w:r>
+              <w:rPr>
+                <w:rFonts w:ascii="BRH Devanagari Extra" w:hAnsi="BRH Devanagari Extra" w:cs="BRH Devanagari Extra"/>
+                <w:color w:val="000000"/>
+                <w:sz w:val="40"/>
+                <w:szCs w:val="40"/>
+              </w:rPr>
+              <w:t xml:space="preserve"> | </w:t>
             </w:r>
           </w:p>
           <w:p>
@@ -8366,6 +9449,7 @@
               </w:rPr>
               <w:t>–</w:t>
             </w:r>
+            <w:proofErr w:type="spellStart"/>
             <w:r>
               <w:rPr>
                 <w:rFonts w:ascii="BRH Devanagari Extra" w:hAnsi="BRH Devanagari Extra" w:cs="BRH Devanagari Extra"/>
@@ -8375,31 +9459,79 @@
               </w:rPr>
               <w:t>ÎlSì</w:t>
             </w:r>
-            <w:r>
-              <w:rPr>
-                <w:rFonts w:ascii="BRH Malayalam Extra" w:hAnsi="BRH Malayalam Extra" w:cs="BRH Devanagari Extra"/>
-                <w:b/>
-                <w:color w:val="000000"/>
-                <w:sz w:val="32"/>
-                <w:szCs w:val="40"/>
-              </w:rPr>
-              <w:t>–</w:t>
-            </w:r>
-            <w:r>
-              <w:rPr>
-                <w:rFonts w:ascii="BRH Devanagari Extra" w:hAnsi="BRH Devanagari Extra" w:cs="BRH Devanagari Extra"/>
-                <w:color w:val="000000"/>
-                <w:sz w:val="40"/>
-                <w:szCs w:val="40"/>
-              </w:rPr>
-              <w:t xml:space="preserve">rÉÇ ÆuÉ×þXç£åü | </w:t>
+            <w:proofErr w:type="spellEnd"/>
+            <w:r>
+              <w:rPr>
+                <w:rFonts w:ascii="BRH Malayalam Extra" w:hAnsi="BRH Malayalam Extra" w:cs="BRH Devanagari Extra"/>
+                <w:b/>
+                <w:color w:val="000000"/>
+                <w:sz w:val="32"/>
+                <w:szCs w:val="40"/>
+              </w:rPr>
+              <w:t>–</w:t>
+            </w:r>
+            <w:proofErr w:type="spellStart"/>
+            <w:r>
+              <w:rPr>
+                <w:rFonts w:ascii="BRH Devanagari Extra" w:hAnsi="BRH Devanagari Extra" w:cs="BRH Devanagari Extra"/>
+                <w:color w:val="000000"/>
+                <w:sz w:val="40"/>
+                <w:szCs w:val="40"/>
+              </w:rPr>
+              <w:t>rÉÇ</w:t>
+            </w:r>
+            <w:proofErr w:type="spellEnd"/>
+            <w:r>
+              <w:rPr>
+                <w:rFonts w:ascii="BRH Devanagari Extra" w:hAnsi="BRH Devanagari Extra" w:cs="BRH Devanagari Extra"/>
+                <w:color w:val="000000"/>
+                <w:sz w:val="40"/>
+                <w:szCs w:val="40"/>
+              </w:rPr>
+              <w:t xml:space="preserve"> </w:t>
+            </w:r>
+            <w:proofErr w:type="spellStart"/>
+            <w:r>
+              <w:rPr>
+                <w:rFonts w:ascii="BRH Devanagari Extra" w:hAnsi="BRH Devanagari Extra" w:cs="BRH Devanagari Extra"/>
+                <w:color w:val="000000"/>
+                <w:sz w:val="40"/>
+                <w:szCs w:val="40"/>
+              </w:rPr>
+              <w:t>ÆuÉ×þXç£åü</w:t>
+            </w:r>
+            <w:proofErr w:type="spellEnd"/>
+            <w:r>
+              <w:rPr>
+                <w:rFonts w:ascii="BRH Devanagari Extra" w:hAnsi="BRH Devanagari Extra" w:cs="BRH Devanagari Extra"/>
+                <w:color w:val="000000"/>
+                <w:sz w:val="40"/>
+                <w:szCs w:val="40"/>
+              </w:rPr>
+              <w:t xml:space="preserve"> | </w:t>
             </w:r>
             <w:r>
               <w:rPr>
                 <w:b/>
                 <w:bCs/>
               </w:rPr>
-              <w:t>(it is “sye”)</w:t>
+              <w:t>(it is “</w:t>
+            </w:r>
+            <w:proofErr w:type="spellStart"/>
+            <w:r>
+              <w:rPr>
+                <w:b/>
+                <w:bCs/>
+              </w:rPr>
+              <w:t>sye</w:t>
+            </w:r>
+            <w:proofErr w:type="spellEnd"/>
+            <w:r>
+              <w:rPr>
+                <w:b/>
+                <w:bCs/>
+              </w:rPr>
+              <w:t>”)</w:t>
             </w:r>
           </w:p>
         </w:tc>
@@ -8432,7 +9564,6 @@
                 <w:szCs w:val="28"/>
                 <w:lang w:val="it-IT"/>
               </w:rPr>
-              <w:lastRenderedPageBreak/>
               <w:t>TS 2.1.4.5</w:t>
             </w:r>
           </w:p>
@@ -8562,14 +9693,25 @@
                 <w:lang w:bidi="ta-IN"/>
               </w:rPr>
             </w:pPr>
-            <w:r>
-              <w:rPr>
-                <w:rFonts w:ascii="BRH Devanagari Extra" w:hAnsi="BRH Devanagari Extra" w:cs="BRH Devanagari Extra"/>
-                <w:color w:val="000000"/>
-                <w:sz w:val="40"/>
-                <w:szCs w:val="40"/>
-              </w:rPr>
-              <w:t xml:space="preserve">ESæÿiÉç | </w:t>
+            <w:proofErr w:type="spellStart"/>
+            <w:r>
+              <w:rPr>
+                <w:rFonts w:ascii="BRH Devanagari Extra" w:hAnsi="BRH Devanagari Extra" w:cs="BRH Devanagari Extra"/>
+                <w:color w:val="000000"/>
+                <w:sz w:val="40"/>
+                <w:szCs w:val="40"/>
+              </w:rPr>
+              <w:t>ESæÿiÉç</w:t>
+            </w:r>
+            <w:proofErr w:type="spellEnd"/>
+            <w:r>
+              <w:rPr>
+                <w:rFonts w:ascii="BRH Devanagari Extra" w:hAnsi="BRH Devanagari Extra" w:cs="BRH Devanagari Extra"/>
+                <w:color w:val="000000"/>
+                <w:sz w:val="40"/>
+                <w:szCs w:val="40"/>
+              </w:rPr>
+              <w:t xml:space="preserve"> | </w:t>
             </w:r>
             <w:r>
               <w:rPr>
@@ -8603,7 +9745,43 @@
                 <w:sz w:val="40"/>
                 <w:szCs w:val="40"/>
               </w:rPr>
-              <w:t>ç iÉqÉç | iÉÍqÉlSìþÈ |</w:t>
+              <w:t xml:space="preserve">ç </w:t>
+            </w:r>
+            <w:proofErr w:type="spellStart"/>
+            <w:r>
+              <w:rPr>
+                <w:rFonts w:ascii="BRH Devanagari Extra" w:hAnsi="BRH Devanagari Extra" w:cs="BRH Devanagari Extra"/>
+                <w:sz w:val="40"/>
+                <w:szCs w:val="40"/>
+              </w:rPr>
+              <w:t>iÉqÉç</w:t>
+            </w:r>
+            <w:proofErr w:type="spellEnd"/>
+            <w:r>
+              <w:rPr>
+                <w:rFonts w:ascii="BRH Devanagari Extra" w:hAnsi="BRH Devanagari Extra" w:cs="BRH Devanagari Extra"/>
+                <w:sz w:val="40"/>
+                <w:szCs w:val="40"/>
+              </w:rPr>
+              <w:t xml:space="preserve"> | </w:t>
+            </w:r>
+            <w:proofErr w:type="spellStart"/>
+            <w:r>
+              <w:rPr>
+                <w:rFonts w:ascii="BRH Devanagari Extra" w:hAnsi="BRH Devanagari Extra" w:cs="BRH Devanagari Extra"/>
+                <w:sz w:val="40"/>
+                <w:szCs w:val="40"/>
+              </w:rPr>
+              <w:t>iÉÍqÉlSìþÈ</w:t>
+            </w:r>
+            <w:proofErr w:type="spellEnd"/>
+            <w:r>
+              <w:rPr>
+                <w:rFonts w:ascii="BRH Devanagari Extra" w:hAnsi="BRH Devanagari Extra" w:cs="BRH Devanagari Extra"/>
+                <w:sz w:val="40"/>
+                <w:szCs w:val="40"/>
+              </w:rPr>
+              <w:t xml:space="preserve"> |</w:t>
             </w:r>
           </w:p>
         </w:tc>
@@ -10092,15 +11270,37 @@
                 <w:lang w:bidi="ta-IN"/>
               </w:rPr>
             </w:pPr>
-            <w:r>
-              <w:rPr>
-                <w:rFonts w:ascii="BRH Devanagari Extra" w:hAnsi="BRH Devanagari Extra" w:cs="BRH Devanagari Extra"/>
-                <w:color w:val="000000"/>
-                <w:sz w:val="40"/>
-                <w:szCs w:val="40"/>
-              </w:rPr>
-              <w:t>iÉiÉÉåþ ÌoÉ</w:t>
-            </w:r>
+            <w:proofErr w:type="spellStart"/>
+            <w:r>
+              <w:rPr>
+                <w:rFonts w:ascii="BRH Devanagari Extra" w:hAnsi="BRH Devanagari Extra" w:cs="BRH Devanagari Extra"/>
+                <w:color w:val="000000"/>
+                <w:sz w:val="40"/>
+                <w:szCs w:val="40"/>
+              </w:rPr>
+              <w:t>iÉiÉÉåþ</w:t>
+            </w:r>
+            <w:proofErr w:type="spellEnd"/>
+            <w:r>
+              <w:rPr>
+                <w:rFonts w:ascii="BRH Devanagari Extra" w:hAnsi="BRH Devanagari Extra" w:cs="BRH Devanagari Extra"/>
+                <w:color w:val="000000"/>
+                <w:sz w:val="40"/>
+                <w:szCs w:val="40"/>
+              </w:rPr>
+              <w:t xml:space="preserve"> </w:t>
+            </w:r>
+            <w:proofErr w:type="spellStart"/>
+            <w:r>
+              <w:rPr>
+                <w:rFonts w:ascii="BRH Devanagari Extra" w:hAnsi="BRH Devanagari Extra" w:cs="BRH Devanagari Extra"/>
+                <w:color w:val="000000"/>
+                <w:sz w:val="40"/>
+                <w:szCs w:val="40"/>
+              </w:rPr>
+              <w:t>ÌoÉ</w:t>
+            </w:r>
+            <w:proofErr w:type="spellEnd"/>
             <w:r>
               <w:rPr>
                 <w:rFonts w:ascii="BRH Malayalam Extra" w:hAnsi="BRH Malayalam Extra" w:cs="BRH Devanagari Extra"/>
@@ -10112,6 +11312,7 @@
               </w:rPr>
               <w:t>–</w:t>
             </w:r>
+            <w:proofErr w:type="spellStart"/>
             <w:r>
               <w:rPr>
                 <w:rFonts w:ascii="BRH Devanagari Extra" w:hAnsi="BRH Devanagari Extra" w:cs="BRH Devanagari Extra"/>
@@ -10122,25 +11323,38 @@
               </w:rPr>
               <w:t>suÉþÈ</w:t>
             </w:r>
-            <w:r>
-              <w:rPr>
-                <w:rFonts w:ascii="BRH Devanagari Extra" w:hAnsi="BRH Devanagari Extra" w:cs="BRH Devanagari Extra"/>
-                <w:color w:val="000000"/>
-                <w:sz w:val="40"/>
-                <w:szCs w:val="40"/>
-              </w:rPr>
-              <w:t xml:space="preserve"> | ÌoÉ</w:t>
-            </w:r>
-            <w:r>
-              <w:rPr>
-                <w:rFonts w:ascii="BRH Malayalam Extra" w:hAnsi="BRH Malayalam Extra" w:cs="BRH Devanagari Extra"/>
-                <w:b/>
-                <w:color w:val="000000"/>
-                <w:sz w:val="32"/>
-                <w:szCs w:val="40"/>
-              </w:rPr>
-              <w:t>–</w:t>
-            </w:r>
+            <w:proofErr w:type="spellEnd"/>
+            <w:r>
+              <w:rPr>
+                <w:rFonts w:ascii="BRH Devanagari Extra" w:hAnsi="BRH Devanagari Extra" w:cs="BRH Devanagari Extra"/>
+                <w:color w:val="000000"/>
+                <w:sz w:val="40"/>
+                <w:szCs w:val="40"/>
+              </w:rPr>
+              <w:t xml:space="preserve"> | </w:t>
+            </w:r>
+            <w:proofErr w:type="spellStart"/>
+            <w:r>
+              <w:rPr>
+                <w:rFonts w:ascii="BRH Devanagari Extra" w:hAnsi="BRH Devanagari Extra" w:cs="BRH Devanagari Extra"/>
+                <w:color w:val="000000"/>
+                <w:sz w:val="40"/>
+                <w:szCs w:val="40"/>
+              </w:rPr>
+              <w:t>ÌoÉ</w:t>
+            </w:r>
+            <w:proofErr w:type="spellEnd"/>
+            <w:r>
+              <w:rPr>
+                <w:rFonts w:ascii="BRH Malayalam Extra" w:hAnsi="BRH Malayalam Extra" w:cs="BRH Devanagari Extra"/>
+                <w:b/>
+                <w:color w:val="000000"/>
+                <w:sz w:val="32"/>
+                <w:szCs w:val="40"/>
+              </w:rPr>
+              <w:t>–</w:t>
+            </w:r>
+            <w:proofErr w:type="spellStart"/>
             <w:r>
               <w:rPr>
                 <w:rFonts w:ascii="BRH Devanagari Extra" w:hAnsi="BRH Devanagari Extra" w:cs="BRH Devanagari Extra"/>
@@ -10158,7 +11372,47 @@
                 <w:sz w:val="40"/>
                 <w:szCs w:val="40"/>
               </w:rPr>
-              <w:t xml:space="preserve">þ EiÉç | </w:t>
+              <w:t>þ</w:t>
+            </w:r>
+            <w:proofErr w:type="spellEnd"/>
+            <w:r>
+              <w:rPr>
+                <w:rFonts w:ascii="BRH Devanagari Extra" w:hAnsi="BRH Devanagari Extra" w:cs="BRH Devanagari Extra"/>
+                <w:color w:val="000000"/>
+                <w:sz w:val="40"/>
+                <w:szCs w:val="40"/>
+              </w:rPr>
+              <w:t xml:space="preserve"> </w:t>
+            </w:r>
+            <w:proofErr w:type="spellStart"/>
+            <w:r>
+              <w:rPr>
+                <w:rFonts w:ascii="BRH Devanagari Extra" w:hAnsi="BRH Devanagari Extra" w:cs="BRH Devanagari Extra"/>
+                <w:color w:val="000000"/>
+                <w:sz w:val="40"/>
+                <w:szCs w:val="40"/>
+              </w:rPr>
+              <w:t>EiÉç</w:t>
+            </w:r>
+            <w:proofErr w:type="spellEnd"/>
+            <w:r>
+              <w:rPr>
+                <w:rFonts w:ascii="BRH Devanagari Extra" w:hAnsi="BRH Devanagari Extra" w:cs="BRH Devanagari Extra"/>
+                <w:color w:val="000000"/>
+                <w:sz w:val="40"/>
+                <w:szCs w:val="40"/>
+              </w:rPr>
+              <w:t xml:space="preserve"> </w:t>
+            </w:r>
+            <w:proofErr w:type="gramStart"/>
+            <w:r>
+              <w:rPr>
+                <w:rFonts w:ascii="BRH Devanagari Extra" w:hAnsi="BRH Devanagari Extra" w:cs="BRH Devanagari Extra"/>
+                <w:color w:val="000000"/>
+                <w:sz w:val="40"/>
+                <w:szCs w:val="40"/>
+              </w:rPr>
+              <w:t xml:space="preserve">| </w:t>
             </w:r>
             <w:r>
               <w:rPr>
@@ -10175,7 +11429,17 @@
                 <w:sz w:val="28"/>
                 <w:szCs w:val="28"/>
               </w:rPr>
-              <w:t>(swarabak</w:t>
+              <w:t>(</w:t>
+            </w:r>
+            <w:proofErr w:type="spellStart"/>
+            <w:proofErr w:type="gramEnd"/>
+            <w:r>
+              <w:rPr>
+                <w:rFonts w:cs="Arial"/>
+                <w:sz w:val="28"/>
+                <w:szCs w:val="28"/>
+              </w:rPr>
+              <w:t>swarabak</w:t>
             </w:r>
             <w:r>
               <w:rPr>
@@ -10193,6 +11457,7 @@
               </w:rPr>
               <w:t>ti</w:t>
             </w:r>
+            <w:proofErr w:type="spellEnd"/>
             <w:r>
               <w:rPr>
                 <w:rFonts w:ascii="BRH Malayalam Extra" w:hAnsi="BRH Malayalam Extra" w:cs="BRH Malayalam Extra"/>
@@ -10241,6 +11506,7 @@
                 <w:szCs w:val="28"/>
                 <w:lang w:val="it-IT"/>
               </w:rPr>
+              <w:lastRenderedPageBreak/>
               <w:t>TS 2.1.8.5</w:t>
             </w:r>
           </w:p>
@@ -10438,7 +11704,25 @@
                 <w:sz w:val="28"/>
                 <w:szCs w:val="28"/>
               </w:rPr>
-              <w:t>(visargam inserted)</w:t>
+              <w:t>(</w:t>
+            </w:r>
+            <w:proofErr w:type="spellStart"/>
+            <w:r>
+              <w:rPr>
+                <w:rFonts w:cs="Arial"/>
+                <w:sz w:val="28"/>
+                <w:szCs w:val="28"/>
+              </w:rPr>
+              <w:t>visargam</w:t>
+            </w:r>
+            <w:proofErr w:type="spellEnd"/>
+            <w:r>
+              <w:rPr>
+                <w:rFonts w:cs="Arial"/>
+                <w:sz w:val="28"/>
+                <w:szCs w:val="28"/>
+              </w:rPr>
+              <w:t xml:space="preserve"> inserted)</w:t>
             </w:r>
           </w:p>
         </w:tc>
@@ -10474,7 +11758,6 @@
                 <w:szCs w:val="28"/>
                 <w:lang w:val="it-IT"/>
               </w:rPr>
-              <w:lastRenderedPageBreak/>
               <w:t xml:space="preserve">TS 2.1.9.3 </w:t>
             </w:r>
           </w:p>
@@ -10927,6 +12210,7 @@
                 <w:lang w:bidi="ta-IN"/>
               </w:rPr>
             </w:pPr>
+            <w:proofErr w:type="spellStart"/>
             <w:r>
               <w:rPr>
                 <w:rFonts w:ascii="BRH Devanagari Extra" w:hAnsi="BRH Devanagari Extra" w:cs="BRH Devanagari Extra"/>
@@ -10936,16 +12220,18 @@
               </w:rPr>
               <w:t>pÉUå</w:t>
             </w:r>
-            <w:r>
-              <w:rPr>
-                <w:rFonts w:ascii="BRH Malayalam Extra" w:hAnsi="BRH Malayalam Extra" w:cs="BRH Devanagari Extra"/>
-                <w:b/>
-                <w:color w:val="000000"/>
-                <w:sz w:val="32"/>
-                <w:szCs w:val="40"/>
-              </w:rPr>
-              <w:t>–</w:t>
-            </w:r>
+            <w:proofErr w:type="spellEnd"/>
+            <w:r>
+              <w:rPr>
+                <w:rFonts w:ascii="BRH Malayalam Extra" w:hAnsi="BRH Malayalam Extra" w:cs="BRH Devanagari Extra"/>
+                <w:b/>
+                <w:color w:val="000000"/>
+                <w:sz w:val="32"/>
+                <w:szCs w:val="40"/>
+              </w:rPr>
+              <w:t>–</w:t>
+            </w:r>
+            <w:proofErr w:type="spellStart"/>
             <w:r>
               <w:rPr>
                 <w:rFonts w:ascii="BRH Devanagari Extra" w:hAnsi="BRH Devanagari Extra" w:cs="BRH Devanagari Extra"/>
@@ -10973,7 +12259,27 @@
                 <w:sz w:val="40"/>
                 <w:szCs w:val="40"/>
               </w:rPr>
-              <w:t>lSìÿqÉç | ClSì</w:t>
+              <w:t>lSìÿqÉç</w:t>
+            </w:r>
+            <w:proofErr w:type="spellEnd"/>
+            <w:r>
+              <w:rPr>
+                <w:rFonts w:ascii="BRH Devanagari Extra" w:hAnsi="BRH Devanagari Extra" w:cs="BRH Devanagari Extra"/>
+                <w:color w:val="000000"/>
+                <w:sz w:val="40"/>
+                <w:szCs w:val="40"/>
+              </w:rPr>
+              <w:t xml:space="preserve"> | </w:t>
+            </w:r>
+            <w:proofErr w:type="spellStart"/>
+            <w:r>
+              <w:rPr>
+                <w:rFonts w:ascii="BRH Devanagari Extra" w:hAnsi="BRH Devanagari Extra" w:cs="BRH Devanagari Extra"/>
+                <w:color w:val="000000"/>
+                <w:sz w:val="40"/>
+                <w:szCs w:val="40"/>
+              </w:rPr>
+              <w:t>ClSì</w:t>
             </w:r>
             <w:r>
               <w:rPr>
@@ -10991,26 +12297,58 @@
                 <w:sz w:val="40"/>
                 <w:szCs w:val="40"/>
               </w:rPr>
-              <w:t>þ xÉÑ</w:t>
-            </w:r>
-            <w:r>
-              <w:rPr>
-                <w:rFonts w:ascii="BRH Malayalam Extra" w:hAnsi="BRH Malayalam Extra" w:cs="BRH Devanagari Extra"/>
-                <w:b/>
-                <w:color w:val="000000"/>
-                <w:sz w:val="32"/>
-                <w:szCs w:val="40"/>
-              </w:rPr>
-              <w:t>–</w:t>
-            </w:r>
-            <w:r>
-              <w:rPr>
-                <w:rFonts w:ascii="BRH Devanagari Extra" w:hAnsi="BRH Devanagari Extra" w:cs="BRH Devanagari Extra"/>
-                <w:color w:val="000000"/>
-                <w:sz w:val="40"/>
-                <w:szCs w:val="40"/>
-              </w:rPr>
-              <w:t>WûuÉÿqÉç |</w:t>
+              <w:t>þ</w:t>
+            </w:r>
+            <w:proofErr w:type="spellEnd"/>
+            <w:r>
+              <w:rPr>
+                <w:rFonts w:ascii="BRH Devanagari Extra" w:hAnsi="BRH Devanagari Extra" w:cs="BRH Devanagari Extra"/>
+                <w:color w:val="000000"/>
+                <w:sz w:val="40"/>
+                <w:szCs w:val="40"/>
+              </w:rPr>
+              <w:t xml:space="preserve"> </w:t>
+            </w:r>
+            <w:proofErr w:type="spellStart"/>
+            <w:r>
+              <w:rPr>
+                <w:rFonts w:ascii="BRH Devanagari Extra" w:hAnsi="BRH Devanagari Extra" w:cs="BRH Devanagari Extra"/>
+                <w:color w:val="000000"/>
+                <w:sz w:val="40"/>
+                <w:szCs w:val="40"/>
+              </w:rPr>
+              <w:t>xÉÑ</w:t>
+            </w:r>
+            <w:proofErr w:type="spellEnd"/>
+            <w:r>
+              <w:rPr>
+                <w:rFonts w:ascii="BRH Malayalam Extra" w:hAnsi="BRH Malayalam Extra" w:cs="BRH Devanagari Extra"/>
+                <w:b/>
+                <w:color w:val="000000"/>
+                <w:sz w:val="32"/>
+                <w:szCs w:val="40"/>
+              </w:rPr>
+              <w:t>–</w:t>
+            </w:r>
+            <w:proofErr w:type="spellStart"/>
+            <w:r>
+              <w:rPr>
+                <w:rFonts w:ascii="BRH Devanagari Extra" w:hAnsi="BRH Devanagari Extra" w:cs="BRH Devanagari Extra"/>
+                <w:color w:val="000000"/>
+                <w:sz w:val="40"/>
+                <w:szCs w:val="40"/>
+              </w:rPr>
+              <w:t>WûuÉÿqÉç</w:t>
+            </w:r>
+            <w:proofErr w:type="spellEnd"/>
+            <w:r>
+              <w:rPr>
+                <w:rFonts w:ascii="BRH Devanagari Extra" w:hAnsi="BRH Devanagari Extra" w:cs="BRH Devanagari Extra"/>
+                <w:color w:val="000000"/>
+                <w:sz w:val="40"/>
+                <w:szCs w:val="40"/>
+              </w:rPr>
+              <w:t xml:space="preserve"> |</w:t>
             </w:r>
           </w:p>
         </w:tc>
@@ -12178,7 +13516,29 @@
           <w:szCs w:val="40"/>
           <w:lang w:val="en-IN" w:eastAsia="en-IN"/>
         </w:rPr>
-        <w:t xml:space="preserve">"zlÉ" </w:t>
+        <w:t>"</w:t>
+      </w:r>
+      <w:proofErr w:type="spellStart"/>
+      <w:r>
+        <w:rPr>
+          <w:rFonts w:ascii="BRH Devanagari" w:hAnsi="BRH Devanagari" w:cs="BRH Devanagari"/>
+          <w:color w:val="000000"/>
+          <w:sz w:val="40"/>
+          <w:szCs w:val="40"/>
+          <w:lang w:val="en-IN" w:eastAsia="en-IN"/>
+        </w:rPr>
+        <w:t>zlÉ</w:t>
+      </w:r>
+      <w:proofErr w:type="spellEnd"/>
+      <w:r>
+        <w:rPr>
+          <w:rFonts w:ascii="BRH Devanagari" w:hAnsi="BRH Devanagari" w:cs="BRH Devanagari"/>
+          <w:color w:val="000000"/>
+          <w:sz w:val="40"/>
+          <w:szCs w:val="40"/>
+          <w:lang w:val="en-IN" w:eastAsia="en-IN"/>
+        </w:rPr>
+        <w:t xml:space="preserve">" </w:t>
       </w:r>
       <w:r>
         <w:rPr>
@@ -12186,7 +13546,16 @@
           <w:bCs/>
           <w:sz w:val="32"/>
         </w:rPr>
-        <w:t>replaced with</w:t>
+        <w:t xml:space="preserve">replaced </w:t>
+      </w:r>
+      <w:proofErr w:type="gramStart"/>
+      <w:r>
+        <w:rPr>
+          <w:b/>
+          <w:bCs/>
+          <w:sz w:val="32"/>
+        </w:rPr>
+        <w:t>with</w:t>
       </w:r>
       <w:r>
         <w:rPr>
@@ -12208,6 +13577,8 @@
         </w:rPr>
         <w:t>"</w:t>
       </w:r>
+      <w:proofErr w:type="spellStart"/>
+      <w:proofErr w:type="gramEnd"/>
       <w:r>
         <w:rPr>
           <w:rFonts w:ascii="BRH Devanagari" w:hAnsi="BRH Devanagari" w:cs="BRH Devanagari"/>
@@ -12219,6 +13590,7 @@
         </w:rPr>
         <w:t>zgÉ</w:t>
       </w:r>
+      <w:proofErr w:type="spellEnd"/>
       <w:r>
         <w:rPr>
           <w:rFonts w:ascii="BRH Devanagari" w:hAnsi="BRH Devanagari" w:cs="BRH Devanagari"/>
@@ -12240,6 +13612,9 @@
     </w:p>
     <w:p>
       <w:pPr>
+        <w:pBdr>
+          <w:bottom w:val="double" w:sz="6" w:space="1" w:color="auto"/>
+        </w:pBdr>
         <w:jc w:val="center"/>
         <w:rPr>
           <w:b/>
@@ -12249,7 +13624,10 @@
           <w:u w:val="single"/>
         </w:rPr>
       </w:pPr>
-      <w:r>
+    </w:p>
+    <w:p>
+      <w:pPr>
+        <w:jc w:val="center"/>
         <w:rPr>
           <w:b/>
           <w:bCs/>
@@ -12257,8 +13635,7 @@
           <w:szCs w:val="32"/>
           <w:u w:val="single"/>
         </w:rPr>
-        <w:t>==========</w:t>
-      </w:r>
+      </w:pPr>
     </w:p>
     <w:p>
       <w:pPr>
@@ -12465,7 +13842,6 @@
                 <w:sz w:val="28"/>
                 <w:szCs w:val="28"/>
               </w:rPr>
-              <w:lastRenderedPageBreak/>
               <w:t>None</w:t>
             </w:r>
           </w:p>
@@ -13400,7 +14776,7 @@
   <w:style w:type="paragraph" w:default="1" w:styleId="Normal">
     <w:name w:val="Normal"/>
     <w:qFormat/>
-    <w:rsid w:val="00076C05"/>
+    <w:rsid w:val="00BE55FF"/>
     <w:pPr>
       <w:spacing w:before="120" w:line="276" w:lineRule="auto"/>
     </w:pPr>

</xml_diff>

<commit_message>
nmv 222 06 2026
</commit_message>
<xml_diff>
--- a/TS-Kramam/TS-2.1/TS 2.1 Sanskrit Krama Paatam Corrections.docx
+++ b/TS-Kramam/TS-2.1/TS 2.1 Sanskrit Krama Paatam Corrections.docx
@@ -101,7 +101,18 @@
           <w:szCs w:val="32"/>
           <w:u w:val="single"/>
         </w:rPr>
-        <w:t xml:space="preserve">Observed till </w:t>
+        <w:t xml:space="preserve">Observed </w:t>
+      </w:r>
+      <w:proofErr w:type="gramStart"/>
+      <w:r>
+        <w:rPr>
+          <w:b/>
+          <w:bCs/>
+          <w:sz w:val="32"/>
+          <w:szCs w:val="32"/>
+          <w:u w:val="single"/>
+        </w:rPr>
+        <w:t xml:space="preserve">till </w:t>
       </w:r>
       <w:r>
         <w:rPr>
@@ -114,6 +125,7 @@
         </w:rPr>
         <w:t>????</w:t>
       </w:r>
+      <w:proofErr w:type="gramEnd"/>
     </w:p>
     <w:p>
       <w:pPr>
@@ -254,7 +266,7 @@
       </w:tr>
       <w:tr>
         <w:trPr>
-          <w:trHeight w:val="1757"/>
+          <w:trHeight w:val="1615"/>
         </w:trPr>
         <w:tc>
           <w:tcPr>
@@ -775,7 +787,7 @@
       </w:tr>
       <w:tr>
         <w:trPr>
-          <w:trHeight w:val="1838"/>
+          <w:trHeight w:val="1555"/>
         </w:trPr>
         <w:tc>
           <w:tcPr>
@@ -881,17 +893,7 @@
                 <w:szCs w:val="28"/>
                 <w:lang w:val="it-IT"/>
               </w:rPr>
-              <w:t>1</w:t>
-            </w:r>
-            <w:r>
-              <w:rPr>
-                <w:rFonts w:cs="Arial"/>
-                <w:b/>
-                <w:sz w:val="28"/>
-                <w:szCs w:val="28"/>
-                <w:lang w:val="it-IT"/>
-              </w:rPr>
-              <w:t>6</w:t>
+              <w:t>16</w:t>
             </w:r>
           </w:p>
         </w:tc>
@@ -2096,7 +2098,7 @@
       </w:tr>
       <w:tr>
         <w:trPr>
-          <w:trHeight w:val="1621"/>
+          <w:trHeight w:val="841"/>
         </w:trPr>
         <w:tc>
           <w:tcPr>
@@ -2131,7 +2133,6 @@
                 <w:szCs w:val="28"/>
                 <w:lang w:val="it-IT"/>
               </w:rPr>
-              <w:lastRenderedPageBreak/>
               <w:t>TS 2.1.</w:t>
             </w:r>
             <w:r>
@@ -2652,7 +2653,7 @@
       </w:tr>
       <w:tr>
         <w:trPr>
-          <w:trHeight w:val="1351"/>
+          <w:trHeight w:val="997"/>
         </w:trPr>
         <w:tc>
           <w:tcPr>
@@ -2687,6 +2688,7 @@
                 <w:szCs w:val="28"/>
                 <w:lang w:val="it-IT"/>
               </w:rPr>
+              <w:lastRenderedPageBreak/>
               <w:t>TS 2.1.</w:t>
             </w:r>
             <w:r>
@@ -4590,7 +4592,6 @@
                 <w:sz w:val="40"/>
                 <w:szCs w:val="40"/>
               </w:rPr>
-              <w:lastRenderedPageBreak/>
               <w:t>AÉ</w:t>
             </w:r>
             <w:r>
@@ -4684,7 +4685,6 @@
                 <w:sz w:val="40"/>
                 <w:szCs w:val="40"/>
               </w:rPr>
-              <w:lastRenderedPageBreak/>
               <w:t>xÉ L</w:t>
             </w:r>
             <w:r>
@@ -4786,7 +4786,6 @@
                 <w:sz w:val="40"/>
                 <w:szCs w:val="40"/>
               </w:rPr>
-              <w:lastRenderedPageBreak/>
               <w:t>AÉ</w:t>
             </w:r>
             <w:r>
@@ -6625,6 +6624,7 @@
           <w:szCs w:val="32"/>
           <w:u w:val="single"/>
         </w:rPr>
+        <w:lastRenderedPageBreak/>
         <w:t xml:space="preserve">TS </w:t>
       </w:r>
       <w:r>
@@ -8543,7 +8543,6 @@
                 <w:szCs w:val="28"/>
                 <w:lang w:val="it-IT"/>
               </w:rPr>
-              <w:lastRenderedPageBreak/>
               <w:t xml:space="preserve">TS 2.1.4.4 </w:t>
             </w:r>
           </w:p>
@@ -8896,6 +8895,7 @@
                 <w:szCs w:val="28"/>
                 <w:lang w:val="it-IT"/>
               </w:rPr>
+              <w:lastRenderedPageBreak/>
               <w:t>TS 2.1.4.5</w:t>
             </w:r>
           </w:p>
@@ -10809,7 +10809,6 @@
                 <w:szCs w:val="28"/>
                 <w:lang w:val="it-IT"/>
               </w:rPr>
-              <w:lastRenderedPageBreak/>
               <w:t>TS 2.1.8.2</w:t>
             </w:r>
           </w:p>
@@ -11073,7 +11072,17 @@
                 <w:sz w:val="40"/>
                 <w:szCs w:val="40"/>
               </w:rPr>
-              <w:t xml:space="preserve">þ EiÉç | </w:t>
+              <w:t xml:space="preserve">þ EiÉç </w:t>
+            </w:r>
+            <w:proofErr w:type="gramStart"/>
+            <w:r>
+              <w:rPr>
+                <w:rFonts w:ascii="BRH Devanagari Extra" w:hAnsi="BRH Devanagari Extra" w:cs="BRH Devanagari Extra"/>
+                <w:color w:val="000000"/>
+                <w:sz w:val="40"/>
+                <w:szCs w:val="40"/>
+              </w:rPr>
+              <w:t xml:space="preserve">| </w:t>
             </w:r>
             <w:r>
               <w:rPr>
@@ -11090,7 +11099,16 @@
                 <w:sz w:val="28"/>
                 <w:szCs w:val="28"/>
               </w:rPr>
-              <w:t>(swarabak</w:t>
+              <w:t>(</w:t>
+            </w:r>
+            <w:proofErr w:type="gramEnd"/>
+            <w:r>
+              <w:rPr>
+                <w:rFonts w:cs="Arial"/>
+                <w:sz w:val="28"/>
+                <w:szCs w:val="28"/>
+              </w:rPr>
+              <w:t>swarabak</w:t>
             </w:r>
             <w:r>
               <w:rPr>
@@ -11156,6 +11174,7 @@
                 <w:szCs w:val="28"/>
                 <w:lang w:val="it-IT"/>
               </w:rPr>
+              <w:lastRenderedPageBreak/>
               <w:t>TS 2.1.8.5</w:t>
             </w:r>
           </w:p>
@@ -13092,7 +13111,6 @@
           <w:szCs w:val="40"/>
           <w:lang w:val="en-IN" w:eastAsia="en-IN"/>
         </w:rPr>
-        <w:lastRenderedPageBreak/>
         <w:t xml:space="preserve">"zlÉ" </w:t>
       </w:r>
       <w:r>
@@ -13101,7 +13119,16 @@
           <w:bCs/>
           <w:sz w:val="32"/>
         </w:rPr>
-        <w:t>replaced with</w:t>
+        <w:t xml:space="preserve">replaced </w:t>
+      </w:r>
+      <w:proofErr w:type="gramStart"/>
+      <w:r>
+        <w:rPr>
+          <w:b/>
+          <w:bCs/>
+          <w:sz w:val="32"/>
+        </w:rPr>
+        <w:t>with</w:t>
       </w:r>
       <w:r>
         <w:rPr>
@@ -13123,6 +13150,7 @@
         </w:rPr>
         <w:t>"</w:t>
       </w:r>
+      <w:proofErr w:type="gramEnd"/>
       <w:r>
         <w:rPr>
           <w:rFonts w:ascii="BRH Devanagari" w:hAnsi="BRH Devanagari" w:cs="BRH Devanagari"/>

</xml_diff>